<commit_message>
feat(preprocessing): add drug-related law extraction
- Implemented query preprocessing logic for legal text
- Added support for identifying and extracting drug-related laws
</commit_message>
<xml_diff>
--- a/backend/chatbot/Data/egyptian_traffic_law.docx
+++ b/backend/chatbot/Data/egyptian_traffic_law.docx
@@ -7,25 +7,38 @@
         <w:jc w:val="right"/>
       </w:pPr>
       <w:r>
-        <w:rPr>
-          <w:b/>
-          <w:bCs/>
-        </w:rPr>
+        <w:br/>
+      </w:r>
+      <w:r>
+        <w:rPr>
+          <w:b/>
+          <w:bCs/>
+          <w:rtl/>
+        </w:rPr>
+        <w:t>مادة</w:t>
+      </w:r>
+      <w:r>
+        <w:rPr>
+          <w:b/>
+          <w:bCs/>
+        </w:rPr>
+        <w:t xml:space="preserve"> ( 2) </w:t>
+      </w:r>
+      <w:r>
+        <w:br/>
+      </w:r>
+      <w:r>
+        <w:rPr>
+          <w:rtl/>
+        </w:rPr>
+        <w:t>على كل مستعمل للطريق أن يراعى فى مسلكه بذل أقصى عناية وإلتزام الحذر والإحتياط اللازمين ، وألا يؤدى مسلكه إلى الإضرار بالغير أو تعريضه للخطر ، أو أن تترتب عليه إعاقة الغير أو مضايقته بأكثر مما تستوجبه الظروف ولا تسمح بتجنبه</w:t>
+      </w:r>
+      <w:r>
         <w:t> </w:t>
       </w:r>
       <w:r>
-        <w:rPr>
-          <w:b/>
-          <w:bCs/>
-          <w:rtl/>
-        </w:rPr>
-        <w:t>اولا : احكام عامة تتعلق بالسير على الطريق</w:t>
-      </w:r>
-    </w:p>
-    <w:p>
-      <w:pPr>
-        <w:jc w:val="right"/>
-      </w:pPr>
+        <w:br/>
+      </w:r>
       <w:r>
         <w:br/>
       </w:r>
@@ -42,19 +55,55 @@
           <w:b/>
           <w:bCs/>
         </w:rPr>
-        <w:t xml:space="preserve"> ( 2) </w:t>
-      </w:r>
-      <w:r>
-        <w:br/>
-      </w:r>
-      <w:r>
-        <w:rPr>
-          <w:rtl/>
-        </w:rPr>
-        <w:t>على كل مستعمل للطريق أن يراعى فى مسلكه بذل أقصى عناية وإلتزام الحذر والإحتياط اللازمين ، وألا يؤدى مسلكه إلى الإضرار بالغير أو تعريضه للخطر ، أو أن تترتب عليه إعاقة الغير أو مضايقته بأكثر مما تستوجبه الظروف ولا تسمح بتجنبه</w:t>
-      </w:r>
-      <w:r>
-        <w:t> </w:t>
+        <w:t xml:space="preserve"> ( 3) </w:t>
+      </w:r>
+      <w:r>
+        <w:br/>
+      </w:r>
+      <w:r>
+        <w:rPr>
+          <w:rtl/>
+        </w:rPr>
+        <w:t>يحظر ترك أو إلقاء ما من شأنه أن يعوق حركة المرور على الطريق أو يسبب خطرا لمستعمليها كالأتربة والحجارة ومواد البناء وغيرها ، كما يجب الإمتناع عن فعل كل ما يؤدى إلى قذارة الطريق</w:t>
+      </w:r>
+      <w:r>
+        <w:t xml:space="preserve"> .</w:t>
+      </w:r>
+      <w:r>
+        <w:br/>
+      </w:r>
+      <w:r>
+        <w:rPr>
+          <w:rtl/>
+        </w:rPr>
+        <w:t>ولا يجوز وضع أشياء فى الطريق أو تركها فيه إذا ترتب على ذلك تعريض المرور للخطر أو إعاقته وعلى المسئول إزالة المخالفة فورا ، وعليه حتى يتم ذلك أن يضع علامة التحذير والتنبيه اللازمة ، وعند الضرورة وضع نور أحمر عليها</w:t>
+      </w:r>
+      <w:r>
+        <w:t xml:space="preserve"> .</w:t>
+      </w:r>
+      <w:r>
+        <w:br/>
+      </w:r>
+      <w:r>
+        <w:rPr>
+          <w:rtl/>
+        </w:rPr>
+        <w:t>ولا يجوز شغل الطريق أو أى جزء من أجزائه أو أرصفته بأى وجه من الوجوه مما يعوق إستعمال الطريق أو سير المشاة</w:t>
+      </w:r>
+      <w:r>
+        <w:t xml:space="preserve"> .</w:t>
+      </w:r>
+      <w:r>
+        <w:br/>
+      </w:r>
+      <w:r>
+        <w:rPr>
+          <w:rtl/>
+        </w:rPr>
+        <w:t>وعلى الهيئات والمؤسسات والشركات العامة والخاصة وغيرها وعلى المقاولين وغيرهم الحصول على موافقة قسم المرور المختص قبل البدء فى إجراء أية إنشاءات أو عمليات حفر أو تعبيد بالطرق ووضع لوحات للتحذير وعلامات حمراء نهارا أو مصابيح تشع ضوءا أحمر ليلا تحدد من بعد لا يقل عن مائة متر من أماكن وجود العمليات والإنشاءات بالطرق . وعلى قسم المرور المختص التأكد قبل منح التصريح بالعمل من إتخاذ كافة الإجراءات الوقائية اللازمة</w:t>
+      </w:r>
+      <w:r>
+        <w:t xml:space="preserve"> .</w:t>
       </w:r>
       <w:r>
         <w:br/>
@@ -75,28 +124,121 @@
           <w:b/>
           <w:bCs/>
         </w:rPr>
-        <w:t xml:space="preserve"> ( 3) </w:t>
-      </w:r>
-      <w:r>
-        <w:br/>
-      </w:r>
-      <w:r>
-        <w:rPr>
-          <w:rtl/>
-        </w:rPr>
-        <w:t>يحظر ترك أو إلقاء ما من شأنه أن يعوق حركة المرور على الطريق أو يسبب خطرا لمستعمليها كالأتربة والحجارة ومواد البناء وغيرها ، كما يجب الإمتناع عن فعل كل ما يؤدى إلى قذارة الطريق</w:t>
+        <w:t xml:space="preserve"> ( 4) </w:t>
+      </w:r>
+      <w:r>
+        <w:br/>
+      </w:r>
+      <w:r>
+        <w:rPr>
+          <w:rtl/>
+        </w:rPr>
+        <w:t>على كل قائد مركبة قبل تحركها الكشف عليها وعلى جميع أجهزتها والتأكد من سلامتها وصلاحيتها للسير بدون وجود خطر عليها من ذلك أو نشوء خطر منها على الغير وهو مسئول عن إستيفاء المركبة لكافة الشروط التى يتطلبها القانون واللوائح وعلى توافر هذه الشروط فى الركاب والحمولة كذلك . ويلزم قائد المركبة ومن يركب بجواره أثناء السير بإستخدام حزام الأمان ، كما يلزم مستخدم الدراجة النارية أثناء السير بإرتداء غطاء الرأس الواقى وكذلك عدم إستخدام التليفون يدويا أثناء القيادة</w:t>
       </w:r>
       <w:r>
         <w:t xml:space="preserve"> .</w:t>
       </w:r>
-      <w:r>
-        <w:br/>
-      </w:r>
-      <w:r>
-        <w:rPr>
-          <w:rtl/>
-        </w:rPr>
-        <w:t>ولا يجوز وضع أشياء فى الطريق أو تركها فيه إذا ترتب على ذلك تعريض المرور للخطر أو إعاقته وعلى المسئول إزالة المخالفة فورا ، وعليه حتى يتم ذلك أن يضع علامة التحذير والتنبيه اللازمة ، وعند الضرورة وضع نور أحمر عليها</w:t>
+    </w:p>
+    <w:p>
+      <w:pPr>
+        <w:jc w:val="right"/>
+      </w:pPr>
+      <w:r>
+        <w:br/>
+      </w:r>
+      <w:r>
+        <w:rPr>
+          <w:b/>
+          <w:bCs/>
+          <w:rtl/>
+        </w:rPr>
+        <w:t>مادة</w:t>
+      </w:r>
+      <w:r>
+        <w:rPr>
+          <w:b/>
+          <w:bCs/>
+        </w:rPr>
+        <w:t xml:space="preserve"> ( 5) </w:t>
+      </w:r>
+      <w:r>
+        <w:br/>
+      </w:r>
+      <w:r>
+        <w:rPr>
+          <w:rtl/>
+        </w:rPr>
+        <w:t>قائد المركبة مسئول عن عدم وجود ما يعوق رؤيته بسبب جلوس أحد فى المركبة أو بسبب حمولتها أو حالتها أو إضافة ملصقات أو معلقات أو غيرهما ويلتزم بعدم جلوس الأطفال حتى سن سبع سنوات بالمقاعد الأمامية ، وبأن تكون جميع الأنوار اللازم وجودها فى المركبة موجودة بها فعلا وصالحة دائما للإستعمال</w:t>
+      </w:r>
+      <w:r>
+        <w:t>.</w:t>
+      </w:r>
+    </w:p>
+    <w:p>
+      <w:pPr>
+        <w:jc w:val="right"/>
+      </w:pPr>
+      <w:r>
+        <w:br/>
+      </w:r>
+      <w:r>
+        <w:rPr>
+          <w:b/>
+          <w:bCs/>
+          <w:rtl/>
+        </w:rPr>
+        <w:t>مادة</w:t>
+      </w:r>
+      <w:r>
+        <w:rPr>
+          <w:b/>
+          <w:bCs/>
+        </w:rPr>
+        <w:t xml:space="preserve"> ( 6) </w:t>
+      </w:r>
+      <w:r>
+        <w:br/>
+      </w:r>
+      <w:r>
+        <w:rPr>
+          <w:rtl/>
+        </w:rPr>
+        <w:t>إذا طرأت أثناء سير المركبة عيوب من شأنها أن تؤثر على أمن المرور وسيولته فعلى قائدها أن يسحبها من المرور من أقصر طريق وفى أسرع وقت ممكن</w:t>
+      </w:r>
+      <w:r>
+        <w:t>.</w:t>
+      </w:r>
+    </w:p>
+    <w:p>
+      <w:pPr>
+        <w:jc w:val="right"/>
+      </w:pPr>
+      <w:r>
+        <w:br/>
+      </w:r>
+      <w:r>
+        <w:rPr>
+          <w:b/>
+          <w:bCs/>
+          <w:rtl/>
+        </w:rPr>
+        <w:t>مادة</w:t>
+      </w:r>
+      <w:r>
+        <w:rPr>
+          <w:b/>
+          <w:bCs/>
+        </w:rPr>
+        <w:t xml:space="preserve"> ( 7) </w:t>
+      </w:r>
+      <w:r>
+        <w:br/>
+      </w:r>
+      <w:r>
+        <w:rPr>
+          <w:rtl/>
+        </w:rPr>
+        <w:t>على قائدى المركبات وغيرها من مستعملى الطريق إفساحه لمرور مركبات الطوارئ المعتمدة ( كالإطفاء والإسعاف والدفاع المدنى والشرطة ) أثناء تحركها متجهة للقيام لخدمة طارئة عاجلة</w:t>
       </w:r>
       <w:r>
         <w:t xml:space="preserve"> .</w:t>
@@ -108,26 +250,28 @@
         <w:rPr>
           <w:rtl/>
         </w:rPr>
-        <w:t>ولا يجوز شغل الطريق أو أى جزء من أجزائه أو أرصفته بأى وجه من الوجوه مما يعوق إستعمال الطريق أو سير المشاة</w:t>
+        <w:t>ولهذه المركبات أن تستعمل أجهزة تنبيه صوتيه ذات أنغام خاصة بها وكذلك أجهزة ضوئية ذات لون أحمر أو أزرق تشع لمسافة لا تقل عن 150 مترا</w:t>
+      </w:r>
+      <w:r>
+        <w:t>.</w:t>
+      </w:r>
+      <w:r>
+        <w:br/>
+      </w:r>
+      <w:r>
+        <w:rPr>
+          <w:rtl/>
+        </w:rPr>
+        <w:t>ولقائد هذه المركبات أثناء إتجاهها لمكان القيام بالخدمة عدم التقيد عند الضرورة بقواعد المرور وإشاراته وعلاماته بشرط بذل أقصى العناية والحرص اللازمين وعدم تعريض حياة الأشخاص أو الأموال للخطر على أن تستعمل أجهزة التنبيه المشار إليها ، ولا تسرى هذه الأحكام الإستثنائية أثناء عودة هذه المركبات من أداء مهمتها</w:t>
       </w:r>
       <w:r>
         <w:t xml:space="preserve"> .</w:t>
       </w:r>
-      <w:r>
-        <w:br/>
-      </w:r>
-      <w:r>
-        <w:rPr>
-          <w:rtl/>
-        </w:rPr>
-        <w:t>وعلى الهيئات والمؤسسات والشركات العامة والخاصة وغيرها وعلى المقاولين وغيرهم الحصول على موافقة قسم المرور المختص قبل البدء فى إجراء أية إنشاءات أو عمليات حفر أو تعبيد بالطرق ووضع لوحات للتحذير وعلامات حمراء نهارا أو مصابيح تشع ضوءا أحمر ليلا تحدد من بعد لا يقل عن مائة متر من أماكن وجود العمليات والإنشاءات بالطرق . وعلى قسم المرور المختص التأكد قبل منح التصريح بالعمل من إتخاذ كافة الإجراءات الوقائية اللازمة</w:t>
-      </w:r>
-      <w:r>
-        <w:t xml:space="preserve"> .</w:t>
-      </w:r>
-      <w:r>
-        <w:br/>
-      </w:r>
+    </w:p>
+    <w:p>
+      <w:pPr>
+        <w:jc w:val="right"/>
+      </w:pPr>
       <w:r>
         <w:br/>
       </w:r>
@@ -144,19 +288,19 @@
           <w:b/>
           <w:bCs/>
         </w:rPr>
-        <w:t xml:space="preserve"> ( 4) </w:t>
-      </w:r>
-      <w:r>
-        <w:br/>
-      </w:r>
-      <w:r>
-        <w:rPr>
-          <w:rtl/>
-        </w:rPr>
-        <w:t>على كل قائد مركبة قبل تحركها الكشف عليها وعلى جميع أجهزتها والتأكد من سلامتها وصلاحيتها للسير بدون وجود خطر عليها من ذلك أو نشوء خطر منها على الغير وهو مسئول عن إستيفاء المركبة لكافة الشروط التى يتطلبها القانون واللوائح وعلى توافر هذه الشروط فى الركاب والحمولة كذلك . ويلزم قائد المركبة ومن يركب بجواره أثناء السير بإستخدام حزام الأمان ، كما يلزم مستخدم الدراجة النارية أثناء السير بإرتداء غطاء الرأس الواقى وكذلك عدم إستخدام التليفون يدويا أثناء القيادة</w:t>
-      </w:r>
-      <w:r>
-        <w:t xml:space="preserve"> .</w:t>
+        <w:t xml:space="preserve"> ( 8) </w:t>
+      </w:r>
+      <w:r>
+        <w:br/>
+      </w:r>
+      <w:r>
+        <w:rPr>
+          <w:rtl/>
+        </w:rPr>
+        <w:t>لا يجوز وضع أو إستعمال أنواع أجهزة التنبيه الضوئية أو الصوتية التى يقتصر إستعمالها على مركبات الطوارئ أو التى تقاربها فى الصوت أو درجة الضوء فى غيرها من المركبات</w:t>
+      </w:r>
+      <w:r>
+        <w:t>.</w:t>
       </w:r>
     </w:p>
     <w:p>
@@ -179,181 +323,23 @@
           <w:b/>
           <w:bCs/>
         </w:rPr>
-        <w:t xml:space="preserve"> ( 5) </w:t>
-      </w:r>
-      <w:r>
-        <w:br/>
-      </w:r>
-      <w:r>
-        <w:rPr>
-          <w:rtl/>
-        </w:rPr>
-        <w:t>قائد المركبة مسئول عن عدم وجود ما يعوق رؤيته بسبب جلوس أحد فى المركبة أو بسبب حمولتها أو حالتها أو إضافة ملصقات أو معلقات أو غيرهما ويلتزم بعدم جلوس الأطفال حتى سن سبع سنوات بالمقاعد الأمامية ، وبأن تكون جميع الأنوار اللازم وجودها فى المركبة موجودة بها فعلا وصالحة دائما للإستعمال</w:t>
-      </w:r>
-      <w:r>
-        <w:t>.</w:t>
-      </w:r>
-    </w:p>
-    <w:p>
-      <w:pPr>
-        <w:jc w:val="right"/>
-      </w:pPr>
-      <w:r>
-        <w:br/>
-      </w:r>
-      <w:r>
-        <w:rPr>
-          <w:b/>
-          <w:bCs/>
-          <w:rtl/>
-        </w:rPr>
-        <w:t>مادة</w:t>
-      </w:r>
-      <w:r>
-        <w:rPr>
-          <w:b/>
-          <w:bCs/>
-        </w:rPr>
-        <w:t xml:space="preserve"> ( 6) </w:t>
-      </w:r>
-      <w:r>
-        <w:br/>
-      </w:r>
-      <w:r>
-        <w:rPr>
-          <w:rtl/>
-        </w:rPr>
-        <w:t>إذا طرأت أثناء سير المركبة عيوب من شأنها أن تؤثر على أمن المرور وسيولته فعلى قائدها أن يسحبها من المرور من أقصر طريق وفى أسرع وقت ممكن</w:t>
-      </w:r>
-      <w:r>
-        <w:t>.</w:t>
-      </w:r>
-    </w:p>
-    <w:p>
-      <w:pPr>
-        <w:jc w:val="right"/>
-      </w:pPr>
-      <w:r>
-        <w:br/>
-      </w:r>
-      <w:r>
-        <w:rPr>
-          <w:b/>
-          <w:bCs/>
-          <w:rtl/>
-        </w:rPr>
-        <w:t>مادة</w:t>
-      </w:r>
-      <w:r>
-        <w:rPr>
-          <w:b/>
-          <w:bCs/>
-        </w:rPr>
-        <w:t xml:space="preserve"> ( 7) </w:t>
-      </w:r>
-      <w:r>
-        <w:br/>
-      </w:r>
-      <w:r>
-        <w:rPr>
-          <w:rtl/>
-        </w:rPr>
-        <w:t>على قائدى المركبات وغيرها من مستعملى الطريق إفساحه لمرور مركبات الطوارئ المعتمدة ( كالإطفاء والإسعاف والدفاع المدنى والشرطة ) أثناء تحركها متجهة للقيام لخدمة طارئة عاجلة</w:t>
-      </w:r>
-      <w:r>
-        <w:t xml:space="preserve"> .</w:t>
-      </w:r>
-      <w:r>
-        <w:br/>
-      </w:r>
-      <w:r>
-        <w:rPr>
-          <w:rtl/>
-        </w:rPr>
-        <w:t>ولهذه المركبات أن تستعمل أجهزة تنبيه صوتيه ذات أنغام خاصة بها وكذلك أجهزة ضوئية ذات لون أحمر أو أزرق تشع لمسافة لا تقل عن 150 مترا</w:t>
-      </w:r>
-      <w:r>
-        <w:t>.</w:t>
-      </w:r>
-      <w:r>
-        <w:br/>
-      </w:r>
-      <w:r>
-        <w:rPr>
-          <w:rtl/>
-        </w:rPr>
-        <w:t>ولقائد هذه المركبات أثناء إتجاهها لمكان القيام بالخدمة عدم التقيد عند الضرورة بقواعد المرور وإشاراته وعلاماته بشرط بذل أقصى العناية والحرص اللازمين وعدم تعريض حياة الأشخاص أو الأموال للخطر على أن تستعمل أجهزة التنبيه المشار إليها ، ولا تسرى هذه الأحكام الإستثنائية أثناء عودة هذه المركبات من أداء مهمتها</w:t>
-      </w:r>
-      <w:r>
-        <w:t xml:space="preserve"> .</w:t>
-      </w:r>
-    </w:p>
-    <w:p>
-      <w:pPr>
-        <w:jc w:val="right"/>
-      </w:pPr>
-      <w:r>
-        <w:br/>
-      </w:r>
-      <w:r>
-        <w:rPr>
-          <w:b/>
-          <w:bCs/>
-          <w:rtl/>
-        </w:rPr>
-        <w:t>مادة</w:t>
-      </w:r>
-      <w:r>
-        <w:rPr>
-          <w:b/>
-          <w:bCs/>
-        </w:rPr>
-        <w:t xml:space="preserve"> ( 8) </w:t>
-      </w:r>
-      <w:r>
-        <w:br/>
-      </w:r>
-      <w:r>
-        <w:rPr>
-          <w:rtl/>
-        </w:rPr>
-        <w:t>لا يجوز وضع أو إستعمال أنواع أجهزة التنبيه الضوئية أو الصوتية التى يقتصر إستعمالها على مركبات الطوارئ أو التى تقاربها فى الصوت أو درجة الضوء فى غيرها من المركبات</w:t>
-      </w:r>
-      <w:r>
-        <w:t>.</w:t>
-      </w:r>
-    </w:p>
-    <w:p>
-      <w:pPr>
-        <w:jc w:val="right"/>
-      </w:pPr>
-      <w:r>
+        <w:t xml:space="preserve"> ( 9) </w:t>
+      </w:r>
+      <w:r>
+        <w:br/>
+      </w:r>
+      <w:r>
+        <w:rPr>
+          <w:rtl/>
+        </w:rPr>
+        <w:t xml:space="preserve">يجوز للمحافظ المختص بعد أخذ رأى المجلس الشعبى المحلى تحديد الطلاء الخاص بأى نوع من أنواع المركبات عدا السيارات </w:t>
+      </w:r>
+      <w:r>
+        <w:rPr>
+          <w:rtl/>
+        </w:rPr>
         <w:lastRenderedPageBreak/>
-        <w:br/>
-      </w:r>
-      <w:r>
-        <w:rPr>
-          <w:b/>
-          <w:bCs/>
-          <w:rtl/>
-        </w:rPr>
-        <w:t>مادة</w:t>
-      </w:r>
-      <w:r>
-        <w:rPr>
-          <w:b/>
-          <w:bCs/>
-        </w:rPr>
-        <w:t xml:space="preserve"> ( 9) </w:t>
-      </w:r>
-      <w:r>
-        <w:br/>
-      </w:r>
-      <w:r>
-        <w:rPr>
-          <w:rtl/>
-        </w:rPr>
-        <w:t>يجوز للمحافظ المختص بعد أخذ رأى المجلس الشعبى المحلى تحديد الطلاء الخاص بأى نوع من أنواع المركبات عدا السيارات الخاصة</w:t>
+        <w:t>الخاصة</w:t>
       </w:r>
       <w:r>
         <w:t xml:space="preserve"> .</w:t>
@@ -675,14 +661,14 @@
         <w:rPr>
           <w:rtl/>
         </w:rPr>
-        <w:t xml:space="preserve">لا يجوز وضع أية كتابة أو رسم أو أية بيانات أخرى غير تلك الواجبة بحكم القانون واللوائح على جسم المركبة أو أى جزء من </w:t>
+        <w:t xml:space="preserve">لا يجوز وضع أية كتابة أو رسم أو أية بيانات أخرى غير تلك الواجبة بحكم القانون واللوائح على جسم المركبة أو أى جزء من أجزائها .ولا يجوز إستعمال المركبات فى الإعلان بوضع لافتات أو نماذج مجسمة على المركبة أو أى جزء خارجى منها إلا بتصريح خاص من المحافظة المختصة بعد موافقة قسم المرور بها ولمدة محددة .ويجوز بعد موافقة قسم المرور المختص بالنسبة لمركبات نقل الركاب والنقل المشترك كتابة إسم المالك وعنوانه وعلامته التجارية أو رمزه ونوع النشاط الذى يمارسه أو تخصص </w:t>
       </w:r>
       <w:r>
         <w:rPr>
           <w:rtl/>
         </w:rPr>
         <w:lastRenderedPageBreak/>
-        <w:t>أجزائها .ولا يجوز إستعمال المركبات فى الإعلان بوضع لافتات أو نماذج مجسمة على المركبة أو أى جزء خارجى منها إلا بتصريح خاص من المحافظة المختصة بعد موافقة قسم المرور بها ولمدة محددة .ويجوز بعد موافقة قسم المرور المختص بالنسبة لمركبات نقل الركاب والنقل المشترك كتابة إسم المالك وعنوانه وعلامته التجارية أو رمزه ونوع النشاط الذى يمارسه أو تخصص له المركبة بشرط ألا يؤثر ذلك على وضوح البيانات التى يتطلب القانون أو هذه اللائحة أو يشترط قسم المرور المختص إثباتها ووضوح رؤيتها</w:t>
+        <w:t>له المركبة بشرط ألا يؤثر ذلك على وضوح البيانات التى يتطلب القانون أو هذه اللائحة أو يشترط قسم المرور المختص إثباتها ووضوح رؤيتها</w:t>
       </w:r>
       <w:r>
         <w:t>.</w:t>
@@ -803,19 +789,6 @@
         <w:jc w:val="right"/>
       </w:pPr>
       <w:r>
-        <w:rPr>
-          <w:b/>
-          <w:bCs/>
-          <w:rtl/>
-        </w:rPr>
-        <w:t>ثانيا : قيادات واستخدام المركبات والحيوانات</w:t>
-      </w:r>
-    </w:p>
-    <w:p>
-      <w:pPr>
-        <w:jc w:val="right"/>
-      </w:pPr>
-      <w:r>
         <w:br/>
       </w:r>
       <w:r>
@@ -1018,48 +991,32 @@
         <w:rPr>
           <w:rtl/>
         </w:rPr>
+        <w:t>لا يجوز ترك محرك مركبة نقل سريع يعمل بغير موجب .ولا يجوز قيادة المركبة داخل المدن فى نفس جزء الطريق ذهابا وجيئة بغير موجب خاصة إذا ترتب على ذلك إزعاج الآخرين</w:t>
+      </w:r>
+      <w:r>
+        <w:t>.</w:t>
+      </w:r>
+    </w:p>
+    <w:p>
+      <w:pPr>
+        <w:jc w:val="right"/>
+      </w:pPr>
+    </w:p>
+    <w:p>
+      <w:pPr>
+        <w:jc w:val="right"/>
+      </w:pPr>
+    </w:p>
+    <w:p>
+      <w:pPr>
+        <w:jc w:val="right"/>
+      </w:pPr>
+      <w:r>
+        <w:rPr>
+          <w:b/>
+          <w:bCs/>
+        </w:rPr>
         <w:lastRenderedPageBreak/>
-        <w:t>لا يجوز ترك محرك مركبة نقل سريع يعمل بغير موجب .ولا يجوز قيادة المركبة داخل المدن فى نفس جزء الطريق ذهابا وجيئة بغير موجب خاصة إذا ترتب على ذلك إزعاج الآخرين</w:t>
-      </w:r>
-      <w:r>
-        <w:t>.</w:t>
-      </w:r>
-    </w:p>
-    <w:p>
-      <w:pPr>
-        <w:jc w:val="right"/>
-      </w:pPr>
-    </w:p>
-    <w:p>
-      <w:pPr>
-        <w:jc w:val="right"/>
-      </w:pPr>
-    </w:p>
-    <w:p>
-      <w:pPr>
-        <w:jc w:val="right"/>
-      </w:pPr>
-      <w:r>
-        <w:rPr>
-          <w:b/>
-          <w:bCs/>
-          <w:rtl/>
-        </w:rPr>
-        <w:t>ثالثا:قواعد السير</w:t>
-      </w:r>
-      <w:r>
-        <w:br/>
-      </w:r>
-    </w:p>
-    <w:p>
-      <w:pPr>
-        <w:jc w:val="right"/>
-      </w:pPr>
-      <w:r>
-        <w:rPr>
-          <w:b/>
-          <w:bCs/>
-        </w:rPr>
         <w:br/>
       </w:r>
     </w:p>
@@ -1310,14 +1267,7 @@
         <w:rPr>
           <w:rtl/>
         </w:rPr>
-        <w:t xml:space="preserve">على كل قائد مركبة يرغب أثناء سيرها فى إجراء إحدى التحركات مثل الخروج من خط سير المركبات التى يتبعها أو الدخول فى هذا الخط أو تغيير إتجاهه نحو يمين المسار أو يساره أو الدوران إلى اليمين أو ا ليسار متجها نحو طريق جانبى أو راغبا الدخول إلى مكان مجاور للطريق أو الخروج منه أو يرغب الدوران إلى الخلف أو الرجوع إلى الوراء مراعاة ألا ينشأ عن مركبته تعريض </w:t>
-      </w:r>
-      <w:r>
-        <w:rPr>
-          <w:rtl/>
-        </w:rPr>
-        <w:lastRenderedPageBreak/>
-        <w:t>الغير للخطر وأن يعلن رغبته فى ذلك بوضوح وفى وقت مناسب وأن يستعمل الإشارة وعليه</w:t>
+        <w:t>على كل قائد مركبة يرغب أثناء سيرها فى إجراء إحدى التحركات مثل الخروج من خط سير المركبات التى يتبعها أو الدخول فى هذا الخط أو تغيير إتجاهه نحو يمين المسار أو يساره أو الدوران إلى اليمين أو ا ليسار متجها نحو طريق جانبى أو راغبا الدخول إلى مكان مجاور للطريق أو الخروج منه أو يرغب الدوران إلى الخلف أو الرجوع إلى الوراء مراعاة ألا ينشأ عن مركبته تعريض الغير للخطر وأن يعلن رغبته فى ذلك بوضوح وفى وقت مناسب وأن يستعمل الإشارة وعليه</w:t>
       </w:r>
       <w:r>
         <w:t xml:space="preserve"> :</w:t>
@@ -1389,6 +1339,7 @@
         <w:rPr>
           <w:rtl/>
         </w:rPr>
+        <w:lastRenderedPageBreak/>
         <w:t>أن يقترب ما أمكن من الحافة اليمنى لنهر الطريق إذا كان سينعطف إلى طريق آخر يقع إلى يمينه أو يقترب ما أمكن من محور نهر الطريق ذى الإتجاهين إذا كان سينتقل إلى طريق آخر يقع على يساره أما فى الطريق ذى الإتجاه الواحد فعليه أن ينتظم فى أقصى اليسار</w:t>
       </w:r>
       <w:r>
@@ -1656,34 +1607,61 @@
         <w:jc w:val="right"/>
       </w:pPr>
       <w:r>
-        <w:rPr>
-          <w:b/>
-          <w:bCs/>
-          <w:rtl/>
-        </w:rPr>
+        <w:br/>
+      </w:r>
+    </w:p>
+    <w:p>
+      <w:pPr>
+        <w:jc w:val="right"/>
+      </w:pPr>
+      <w:r>
+        <w:rPr>
+          <w:b/>
+          <w:bCs/>
+        </w:rPr>
+        <w:br/>
+      </w:r>
+    </w:p>
+    <w:p>
+      <w:pPr>
+        <w:jc w:val="right"/>
+      </w:pPr>
+      <w:r>
+        <w:rPr>
+          <w:b/>
+          <w:bCs/>
+          <w:rtl/>
+        </w:rPr>
+        <w:t>مادة</w:t>
+      </w:r>
+      <w:r>
+        <w:rPr>
+          <w:b/>
+          <w:bCs/>
+        </w:rPr>
+        <w:t xml:space="preserve"> ( 34) </w:t>
+      </w:r>
+      <w:r>
+        <w:br/>
+      </w:r>
+      <w:r>
+        <w:rPr>
+          <w:rtl/>
+        </w:rPr>
+        <w:t>على قائد المركبة أن يترك بينه وبين المركبة التى أمامه مسافة تكون كافية لتمكينه من التوقف عندما تخفض المركبة الأمامية سرعتها أو تتوقف فجأة وعليه أن يتنبه لإشارات قائدها وعلى قائد المركبة الأمامية ألا يستعمل الفرامل فجأة بغير موجب قوى</w:t>
+      </w:r>
+      <w:r>
+        <w:t>.</w:t>
+      </w:r>
+    </w:p>
+    <w:p>
+      <w:pPr>
+        <w:jc w:val="right"/>
+      </w:pPr>
+      <w:r>
         <w:lastRenderedPageBreak/>
-        <w:t>رابعا:مسافات الأمان</w:t>
-      </w:r>
-      <w:r>
-        <w:br/>
-      </w:r>
-    </w:p>
-    <w:p>
-      <w:pPr>
-        <w:jc w:val="right"/>
-      </w:pPr>
-      <w:r>
-        <w:rPr>
-          <w:b/>
-          <w:bCs/>
-        </w:rPr>
-        <w:br/>
-      </w:r>
-    </w:p>
-    <w:p>
-      <w:pPr>
-        <w:jc w:val="right"/>
-      </w:pPr>
+        <w:br/>
+      </w:r>
       <w:r>
         <w:rPr>
           <w:b/>
@@ -1697,16 +1675,16 @@
           <w:b/>
           <w:bCs/>
         </w:rPr>
-        <w:t xml:space="preserve"> ( 34) </w:t>
-      </w:r>
-      <w:r>
-        <w:br/>
-      </w:r>
-      <w:r>
-        <w:rPr>
-          <w:rtl/>
-        </w:rPr>
-        <w:t>على قائد المركبة أن يترك بينه وبين المركبة التى أمامه مسافة تكون كافية لتمكينه من التوقف عندما تخفض المركبة الأمامية سرعتها أو تتوقف فجأة وعليه أن يتنبه لإشارات قائدها وعلى قائد المركبة الأمامية ألا يستعمل الفرامل فجأة بغير موجب قوى</w:t>
+        <w:t xml:space="preserve"> ( 35) </w:t>
+      </w:r>
+      <w:r>
+        <w:br/>
+      </w:r>
+      <w:r>
+        <w:rPr>
+          <w:rtl/>
+        </w:rPr>
+        <w:t>على المركبات بطيئة السرعة ومركبات النقل البطئ وغيرها من المركبات التى يجاوز طولها سبعة أمتار أن تترك بينها وبين المركبة السابقة لها بعدا كافيا بحيث يمكن لمركبة تتخطاها أن تدخل فى تلك المسافة ولا يسرى ذلك إذا كانت هى نفسها قد إنحرفت لبدء التخطى وأعلنت ذلك أو إذا كان إتجاه المرور مقسما إلى أكثر من مسار وكذلك فى الأجزاء الممنوع فيها التخطى</w:t>
       </w:r>
       <w:r>
         <w:t>.</w:t>
@@ -1732,16 +1710,16 @@
           <w:b/>
           <w:bCs/>
         </w:rPr>
-        <w:t xml:space="preserve"> ( 35) </w:t>
-      </w:r>
-      <w:r>
-        <w:br/>
-      </w:r>
-      <w:r>
-        <w:rPr>
-          <w:rtl/>
-        </w:rPr>
-        <w:t>على المركبات بطيئة السرعة ومركبات النقل البطئ وغيرها من المركبات التى يجاوز طولها سبعة أمتار أن تترك بينها وبين المركبة السابقة لها بعدا كافيا بحيث يمكن لمركبة تتخطاها أن تدخل فى تلك المسافة ولا يسرى ذلك إذا كانت هى نفسها قد إنحرفت لبدء التخطى وأعلنت ذلك أو إذا كان إتجاه المرور مقسما إلى أكثر من مسار وكذلك فى الأجزاء الممنوع فيها التخطى</w:t>
+        <w:t xml:space="preserve"> ( 36) </w:t>
+      </w:r>
+      <w:r>
+        <w:br/>
+      </w:r>
+      <w:r>
+        <w:rPr>
+          <w:rtl/>
+        </w:rPr>
+        <w:t>على قائدى كل من المركبات التى تسير فى مجموعة واحدة متصلة ببعضها أن يتركوا بين كل مركبة من مركباتهم والأخرى مسافة كافية لا تقل عن ثلاثين مترا حتى يمكن للمركبات الأسرع منها عند قيامها بعملية التخطى اللجوء إلى هذه المسافات لتفادى الحوادث والأخطار</w:t>
       </w:r>
       <w:r>
         <w:t>.</w:t>
@@ -1751,9 +1729,23 @@
       <w:pPr>
         <w:jc w:val="right"/>
       </w:pPr>
-      <w:r>
-        <w:br/>
-      </w:r>
+    </w:p>
+    <w:p>
+      <w:pPr>
+        <w:jc w:val="right"/>
+      </w:pPr>
+      <w:r>
+        <w:rPr>
+          <w:b/>
+          <w:bCs/>
+        </w:rPr>
+        <w:br/>
+      </w:r>
+    </w:p>
+    <w:p>
+      <w:pPr>
+        <w:jc w:val="right"/>
+      </w:pPr>
       <w:r>
         <w:rPr>
           <w:b/>
@@ -1767,16 +1759,16 @@
           <w:b/>
           <w:bCs/>
         </w:rPr>
-        <w:t xml:space="preserve"> ( 36) </w:t>
-      </w:r>
-      <w:r>
-        <w:br/>
-      </w:r>
-      <w:r>
-        <w:rPr>
-          <w:rtl/>
-        </w:rPr>
-        <w:t>على قائدى كل من المركبات التى تسير فى مجموعة واحدة متصلة ببعضها أن يتركوا بين كل مركبة من مركباتهم والأخرى مسافة كافية لا تقل عن ثلاثين مترا حتى يمكن للمركبات الأسرع منها عند قيامها بعملية التخطى اللجوء إلى هذه المسافات لتفادى الحوادث والأخطار</w:t>
+        <w:t xml:space="preserve"> ( 37) </w:t>
+      </w:r>
+      <w:r>
+        <w:br/>
+      </w:r>
+      <w:r>
+        <w:rPr>
+          <w:rtl/>
+        </w:rPr>
+        <w:t>على كل قائد مركبة عند تقابل مركبته بمركبة أخرى قادمة من الإتجاه المضاد أن يقترب بقدر الإمكان من الحافة اليمنى فى إتجاه المرور الذى يسلكه بحيث يترك مسافة جانبية كافية شاغرة على يساره وإذا لم يتيسر ترك هذه المسافة بسب وجود عقبة أو مستعملين آخرين للطريق وجب عليه تهدئة السرعة بل والتوقف عند اللزوم إلى حين مرور مستعملى الطريق المقابلين فى الإتجاه المضاد</w:t>
       </w:r>
       <w:r>
         <w:t>.</w:t>
@@ -1786,39 +1778,9 @@
       <w:pPr>
         <w:jc w:val="right"/>
       </w:pPr>
-    </w:p>
-    <w:p>
-      <w:pPr>
-        <w:jc w:val="right"/>
-      </w:pPr>
-      <w:r>
-        <w:rPr>
-          <w:b/>
-          <w:bCs/>
-          <w:rtl/>
-        </w:rPr>
-        <w:t>خامسا:التقابل</w:t>
-      </w:r>
-      <w:r>
-        <w:br/>
-      </w:r>
-    </w:p>
-    <w:p>
-      <w:pPr>
-        <w:jc w:val="right"/>
-      </w:pPr>
-      <w:r>
-        <w:rPr>
-          <w:b/>
-          <w:bCs/>
-        </w:rPr>
-        <w:br/>
-      </w:r>
-    </w:p>
-    <w:p>
-      <w:pPr>
-        <w:jc w:val="right"/>
-      </w:pPr>
+      <w:r>
+        <w:br/>
+      </w:r>
       <w:r>
         <w:rPr>
           <w:b/>
@@ -1832,16 +1794,16 @@
           <w:b/>
           <w:bCs/>
         </w:rPr>
-        <w:t xml:space="preserve"> ( 37) </w:t>
-      </w:r>
-      <w:r>
-        <w:br/>
-      </w:r>
-      <w:r>
-        <w:rPr>
-          <w:rtl/>
-        </w:rPr>
-        <w:t>على كل قائد مركبة عند تقابل مركبته بمركبة أخرى قادمة من الإتجاه المضاد أن يقترب بقدر الإمكان من الحافة اليمنى فى إتجاه المرور الذى يسلكه بحيث يترك مسافة جانبية كافية شاغرة على يساره وإذا لم يتيسر ترك هذه المسافة بسب وجود عقبة أو مستعملين آخرين للطريق وجب عليه تهدئة السرعة بل والتوقف عند اللزوم إلى حين مرور مستعملى الطريق المقابلين فى الإتجاه المضاد</w:t>
+        <w:t xml:space="preserve"> ( 38) </w:t>
+      </w:r>
+      <w:r>
+        <w:br/>
+      </w:r>
+      <w:r>
+        <w:rPr>
+          <w:rtl/>
+        </w:rPr>
+        <w:t>فى الطرق التى يصاحب التقابل فيها صعوبة أو خطورة كما فى الطرق المنحدرة يجب على قائد المركبة فى الإتجاه النازل أن يسير أقرب ما يمكن من الحافة اليمنى لإتجاه المرور بالنسبة له أو يتوقف تماما ليسمح للمركبة الصاعدة أن تمر بدون صعوبة فإذا كانت المركبة الصاعدة موجودة من قسم عريض من الطريق يستعمل أو يمكن إستعماله كموقف مؤقت وجب على قائدها التوقف فى هذا المكان ليسمح بمرور المركبة النازلة</w:t>
       </w:r>
       <w:r>
         <w:t>.</w:t>
@@ -1851,9 +1813,16 @@
       <w:pPr>
         <w:jc w:val="right"/>
       </w:pPr>
-      <w:r>
-        <w:br/>
-      </w:r>
+    </w:p>
+    <w:p>
+      <w:pPr>
+        <w:jc w:val="right"/>
+      </w:pPr>
+    </w:p>
+    <w:p>
+      <w:pPr>
+        <w:jc w:val="right"/>
+      </w:pPr>
       <w:r>
         <w:rPr>
           <w:b/>
@@ -1867,16 +1836,16 @@
           <w:b/>
           <w:bCs/>
         </w:rPr>
-        <w:t xml:space="preserve"> ( 38) </w:t>
-      </w:r>
-      <w:r>
-        <w:br/>
-      </w:r>
-      <w:r>
-        <w:rPr>
-          <w:rtl/>
-        </w:rPr>
-        <w:t>فى الطرق التى يصاحب التقابل فيها صعوبة أو خطورة كما فى الطرق المنحدرة يجب على قائد المركبة فى الإتجاه النازل أن يسير أقرب ما يمكن من الحافة اليمنى لإتجاه المرور بالنسبة له أو يتوقف تماما ليسمح للمركبة الصاعدة أن تمر بدون صعوبة فإذا كانت المركبة الصاعدة موجودة من قسم عريض من الطريق يستعمل أو يمكن إستعماله كموقف مؤقت وجب على قائدها التوقف فى هذا المكان ليسمح بمرور المركبة النازلة</w:t>
+        <w:t xml:space="preserve"> (39) </w:t>
+      </w:r>
+      <w:r>
+        <w:br/>
+      </w:r>
+      <w:r>
+        <w:rPr>
+          <w:rtl/>
+        </w:rPr>
+        <w:t>يكون التخطى من اليسار دائما ولا يجوز إلا لمن يمكنه الرؤية الواضحة الكاملة وبعد التأكد من عدم وجود أى عائق أو خطورة من المرور المضاد أثناء كل عملية التخطى حتى إتمامها</w:t>
       </w:r>
       <w:r>
         <w:t>.</w:t>
@@ -1886,66 +1855,7 @@
       <w:pPr>
         <w:jc w:val="right"/>
       </w:pPr>
-    </w:p>
-    <w:p>
-      <w:pPr>
-        <w:jc w:val="right"/>
-      </w:pPr>
-      <w:r>
-        <w:rPr>
-          <w:b/>
-          <w:bCs/>
-          <w:rtl/>
-        </w:rPr>
-        <w:t>سادسا:التخطى</w:t>
-      </w:r>
-      <w:r>
-        <w:br/>
-      </w:r>
-    </w:p>
-    <w:p>
-      <w:pPr>
-        <w:jc w:val="right"/>
-      </w:pPr>
-    </w:p>
-    <w:p>
-      <w:pPr>
-        <w:jc w:val="right"/>
-      </w:pPr>
-      <w:r>
-        <w:rPr>
-          <w:b/>
-          <w:bCs/>
-          <w:rtl/>
-        </w:rPr>
-        <w:t>مادة</w:t>
-      </w:r>
-      <w:r>
-        <w:rPr>
-          <w:b/>
-          <w:bCs/>
-        </w:rPr>
-        <w:t xml:space="preserve"> (39) </w:t>
-      </w:r>
-      <w:r>
-        <w:br/>
-      </w:r>
-      <w:r>
-        <w:rPr>
-          <w:rtl/>
-        </w:rPr>
-        <w:t>يكون التخطى من اليسار دائما ولا يجوز إلا لمن يمكنه الرؤية الواضحة الكاملة وبعد التأكد من عدم وجود أى عائق أو خطورة من المرور المضاد أثناء كل عملية التخطى حتى إتمامها</w:t>
-      </w:r>
-      <w:r>
-        <w:t>.</w:t>
-      </w:r>
-    </w:p>
-    <w:p>
-      <w:pPr>
-        <w:jc w:val="right"/>
-      </w:pPr>
-      <w:r>
-        <w:lastRenderedPageBreak/>
+      <w:r>
         <w:t> </w:t>
       </w:r>
       <w:r>
@@ -2063,6 +1973,7 @@
         <w:rPr>
           <w:rtl/>
         </w:rPr>
+        <w:lastRenderedPageBreak/>
         <w:t>الإبتعاد أثناء التخطى عن مستعملى الطريق الذين يتخطاهم بحيث يترك بينه وبينهم مسافة كافية وخاصة من الناحية الجانبية</w:t>
       </w:r>
     </w:p>
@@ -2317,7 +2228,6 @@
         <w:rPr>
           <w:rtl/>
         </w:rPr>
-        <w:lastRenderedPageBreak/>
         <w:t>إذا كان مدى الرؤية حوله غير كاف</w:t>
       </w:r>
     </w:p>
@@ -2472,6 +2382,7 @@
           <w:bCs/>
           <w:rtl/>
         </w:rPr>
+        <w:lastRenderedPageBreak/>
         <w:t>مادة</w:t>
       </w:r>
       <w:r>
@@ -2498,29 +2409,6 @@
       <w:pPr>
         <w:jc w:val="right"/>
       </w:pPr>
-    </w:p>
-    <w:p>
-      <w:pPr>
-        <w:jc w:val="right"/>
-      </w:pPr>
-      <w:r>
-        <w:rPr>
-          <w:b/>
-          <w:bCs/>
-          <w:rtl/>
-        </w:rPr>
-        <w:t>سابعا:السرعة</w:t>
-      </w:r>
-      <w:r>
-        <w:rPr>
-          <w:b/>
-          <w:bCs/>
-        </w:rPr>
-        <w:t> </w:t>
-      </w:r>
-      <w:r>
-        <w:br/>
-      </w:r>
     </w:p>
     <w:p>
       <w:pPr>
@@ -2700,7 +2588,6 @@
           <w:bCs/>
           <w:rtl/>
         </w:rPr>
-        <w:lastRenderedPageBreak/>
         <w:t>داخل التجمعات السكنية والصناعية والسياحية</w:t>
       </w:r>
       <w:r>
@@ -2910,6 +2797,7 @@
         <w:jc w:val="right"/>
       </w:pPr>
       <w:r>
+        <w:lastRenderedPageBreak/>
         <w:t xml:space="preserve">80 </w:t>
       </w:r>
       <w:r>
@@ -3137,14 +3025,7 @@
         <w:rPr>
           <w:rtl/>
         </w:rPr>
-        <w:t xml:space="preserve">لا يجوز لمركبات النقل العام للركاب ومركبات النقل أن يتخطى بعضها بعضا داخل المدن كما لا يجوز أن يتخطى بعضها بعضا </w:t>
-      </w:r>
-      <w:r>
-        <w:rPr>
-          <w:rtl/>
-        </w:rPr>
-        <w:lastRenderedPageBreak/>
-        <w:t>خارج المدن إلا إذا كان ذلك لا يؤدى إلى عرقلة المرور بالطريق . ولا يجوز لمركبات النقل البطئ من نفس النوع أن يتخطى بعضها بعضا إلا إذا لم يؤدى ذلك إلى عرقلة المرور</w:t>
+        <w:t>لا يجوز لمركبات النقل العام للركاب ومركبات النقل أن يتخطى بعضها بعضا داخل المدن كما لا يجوز أن يتخطى بعضها بعضا خارج المدن إلا إذا كان ذلك لا يؤدى إلى عرقلة المرور بالطريق . ولا يجوز لمركبات النقل البطئ من نفس النوع أن يتخطى بعضها بعضا إلا إذا لم يؤدى ذلك إلى عرقلة المرور</w:t>
       </w:r>
       <w:r>
         <w:t>.</w:t>
@@ -3159,22 +3040,6 @@
       <w:pPr>
         <w:jc w:val="right"/>
       </w:pPr>
-    </w:p>
-    <w:p>
-      <w:pPr>
-        <w:jc w:val="right"/>
-      </w:pPr>
-      <w:r>
-        <w:rPr>
-          <w:b/>
-          <w:bCs/>
-          <w:rtl/>
-        </w:rPr>
-        <w:t>ثامنا:التقاطعات وأولويات المرور</w:t>
-      </w:r>
-      <w:r>
-        <w:br/>
-      </w:r>
     </w:p>
     <w:p>
       <w:pPr>
@@ -3290,6 +3155,7 @@
         <w:rPr>
           <w:rtl/>
         </w:rPr>
+        <w:lastRenderedPageBreak/>
         <w:t>للمركبات القادمة من اليمين أيا كان نوعها بالنسبة لأية مركبة أخرى وذلك عند تقاطع طرق متساوية الأهمية</w:t>
       </w:r>
     </w:p>
@@ -3448,7 +3314,6 @@
         <w:jc w:val="right"/>
       </w:pPr>
       <w:r>
-        <w:lastRenderedPageBreak/>
         <w:br/>
       </w:r>
       <w:r>
@@ -3609,22 +3474,6 @@
       <w:pPr>
         <w:jc w:val="right"/>
       </w:pPr>
-      <w:r>
-        <w:rPr>
-          <w:b/>
-          <w:bCs/>
-          <w:rtl/>
-        </w:rPr>
-        <w:t>ثامنا:التقاطعات وأولويات المرور</w:t>
-      </w:r>
-      <w:r>
-        <w:br/>
-      </w:r>
-    </w:p>
-    <w:p>
-      <w:pPr>
-        <w:jc w:val="right"/>
-      </w:pPr>
     </w:p>
     <w:p>
       <w:pPr>
@@ -3655,6 +3504,7 @@
         <w:rPr>
           <w:rtl/>
         </w:rPr>
+        <w:lastRenderedPageBreak/>
         <w:t>على قائد المركبة القادم من طريق فرعى ويتأهب للدخول فى طريق رئيسى أو من طريق غير مرصوف للدخول فى طريق معبد أن يقف حتى يسمح أولا بمرور المركبات القادمة على هذا الطريق ولا يبدأ فى الدخول إلا بعد تأكده من عدم تعريض المرور فيه للخطر</w:t>
       </w:r>
       <w:r>
@@ -3801,7 +3651,6 @@
           <w:bCs/>
           <w:rtl/>
         </w:rPr>
-        <w:lastRenderedPageBreak/>
         <w:t>مادة</w:t>
       </w:r>
       <w:r>
@@ -3984,6 +3833,7 @@
           <w:bCs/>
           <w:rtl/>
         </w:rPr>
+        <w:lastRenderedPageBreak/>
         <w:t>و على كافة المركبات الأخرى الوقوف قبل الصليب المائل ( صليب سانت اندروز ) وفى المشاة الوقوف قبل المزلقانات بمسافة كافية عند</w:t>
       </w:r>
       <w:r>
@@ -4066,19 +3916,6 @@
         <w:rPr>
           <w:b/>
           <w:bCs/>
-          <w:rtl/>
-        </w:rPr>
-        <w:t>تاسعا:التوقف</w:t>
-      </w:r>
-    </w:p>
-    <w:p>
-      <w:pPr>
-        <w:jc w:val="right"/>
-      </w:pPr>
-      <w:r>
-        <w:rPr>
-          <w:b/>
-          <w:bCs/>
         </w:rPr>
         <w:br/>
       </w:r>
@@ -4144,164 +3981,158 @@
         <w:rPr>
           <w:rtl/>
         </w:rPr>
-        <w:t xml:space="preserve">يجب أن تجرى عملية توقف المركبة بصورة تدريجية لا ينتج عنا أية مضايقة لحركة المرور بعد إعطاء الإشارة الدالة على ذلك </w:t>
-      </w:r>
-      <w:r>
-        <w:rPr>
-          <w:rtl/>
-        </w:rPr>
+        <w:t>يجب أن تجرى عملية توقف المركبة بصورة تدريجية لا ينتج عنا أية مضايقة لحركة المرور بعد إعطاء الإشارة الدالة على ذلك سواء أكانت ضوئية أو يدوية وعلى كل قائد أن يضع مركبته أو حيواناته أقرب ما يمكن من الحافة اليمنى لنهر الطريق وموازية له ما لم تسمح المنطقة المسموح بالإنتظار فيها بغير ذلك . ويجوز التوقف أو الإنتظار بالقرب من الحافة اليسرى عندما يكون الجانب الأيمن ممنوعا بواسطة علامات المرور أو لوجود خطوط سكك حديدية وكذلك عندما يكون التوقف أو الإنتظار فى طريق ذو إتجاه واحد مسموحا فيه بالإنتظار على الجانب الأيسر وممنوعا على الجانب الأيمن كما يجوز التوقف أو الإنتظار فى وسط نهر الطريق وفى بعض الأماكن المحددة بعلامات تشير إلى ذلك</w:t>
+      </w:r>
+      <w:r>
+        <w:t>.</w:t>
+      </w:r>
+    </w:p>
+    <w:p>
+      <w:pPr>
+        <w:jc w:val="right"/>
+      </w:pPr>
+      <w:r>
+        <w:br/>
+      </w:r>
+      <w:r>
+        <w:rPr>
+          <w:b/>
+          <w:bCs/>
+          <w:rtl/>
+        </w:rPr>
+        <w:t>مادة</w:t>
+      </w:r>
+      <w:r>
+        <w:rPr>
+          <w:b/>
+          <w:bCs/>
+        </w:rPr>
+        <w:t xml:space="preserve"> ( 64)</w:t>
+      </w:r>
+      <w:r>
+        <w:br/>
+      </w:r>
+      <w:r>
+        <w:rPr>
+          <w:rtl/>
+        </w:rPr>
+        <w:t>يجب أن يكون توقف أو إنتظار المركبات أو الحيوانات فى خارج المدن وفى المناطق غير المأهولة فى أقصى يمين نهر الطريق فى إتجاه حركة المرور مع تجنب أقسام الطريق المخصصة لسير الدراجات والأماكن المخصصة لسير الدراجات والأماكن المخصصة لمرور المشاة .وعلى قائد المركبة فى حالة إضطراره لإيقافها فى نهر الطريق إستخدام إشارة التحذير الضوئية وعلامة تحذيرية عاكسة لقائدى المركبات المقتربة بحيث تكون هذه الإشارة مرئية على مسافة كافية وخاصة عندما يكون التوقف ليلا أو فى مكان ممنوع التوقف فيه</w:t>
+      </w:r>
+      <w:r>
+        <w:t>.</w:t>
+      </w:r>
+    </w:p>
+    <w:p>
+      <w:pPr>
+        <w:jc w:val="right"/>
+      </w:pPr>
+      <w:r>
+        <w:br/>
+      </w:r>
+      <w:r>
+        <w:rPr>
+          <w:b/>
+          <w:bCs/>
+          <w:rtl/>
+        </w:rPr>
+        <w:t>مادة</w:t>
+      </w:r>
+      <w:r>
+        <w:rPr>
+          <w:b/>
+          <w:bCs/>
+        </w:rPr>
+        <w:t xml:space="preserve"> ( 65)</w:t>
+      </w:r>
+      <w:r>
+        <w:br/>
+      </w:r>
+      <w:r>
+        <w:rPr>
+          <w:rtl/>
+        </w:rPr>
+        <w:t>لا يجوز بأية حال التوقف بالمركبة على بعد يقل عن خمسة أمتار من مفارق الطرق ومداخل الميادين وأماكن عبور المشاة ومحطات مركبات النقل العام للركاب والمزلقانات</w:t>
+      </w:r>
+      <w:r>
+        <w:t>.</w:t>
+      </w:r>
+    </w:p>
+    <w:p>
+      <w:pPr>
+        <w:jc w:val="right"/>
+      </w:pPr>
+      <w:r>
+        <w:br/>
+      </w:r>
+      <w:r>
+        <w:rPr>
+          <w:b/>
+          <w:bCs/>
+          <w:rtl/>
+        </w:rPr>
+        <w:t>مادة</w:t>
+      </w:r>
+      <w:r>
+        <w:rPr>
+          <w:b/>
+          <w:bCs/>
+        </w:rPr>
+        <w:t xml:space="preserve"> ( 66)</w:t>
+      </w:r>
+      <w:r>
+        <w:br/>
+      </w:r>
+      <w:r>
+        <w:rPr>
+          <w:rtl/>
+        </w:rPr>
+        <w:t>يكون إنتظار المركبات فى الأماكن المخصصة لذلك وفى صف منتظم وفى إتجاه حركة المرور .ولا يجوز الإنتظار إلا فى الأماكن المسموح الإنتظار فيها وبما لا يقل عن خمسة أمتار من مفارق الطرق ومداخل الميادين وأماكن عبور المشاة ومحطات مركبات النقل العام للركاب والمزلقانات</w:t>
+      </w:r>
+      <w:r>
+        <w:t>.</w:t>
+      </w:r>
+    </w:p>
+    <w:p>
+      <w:pPr>
+        <w:jc w:val="right"/>
+      </w:pPr>
+      <w:r>
+        <w:br/>
+      </w:r>
+      <w:r>
+        <w:rPr>
+          <w:b/>
+          <w:bCs/>
+          <w:rtl/>
+        </w:rPr>
+        <w:t>مادة</w:t>
+      </w:r>
+      <w:r>
+        <w:rPr>
+          <w:b/>
+          <w:bCs/>
+        </w:rPr>
+        <w:t xml:space="preserve"> ( 67)</w:t>
+      </w:r>
+      <w:r>
+        <w:br/>
+      </w:r>
+      <w:r>
+        <w:rPr>
+          <w:rtl/>
+        </w:rPr>
+        <w:t>فى جميع الأحوال يجب أن يكون التوقف أو الإنتظار بحيث لا يؤدى إلى إعاقة المرور بالطريق أو إعاقة الرؤية فيه</w:t>
+      </w:r>
+      <w:r>
+        <w:t>.</w:t>
+      </w:r>
+    </w:p>
+    <w:p>
+      <w:pPr>
+        <w:jc w:val="right"/>
+      </w:pPr>
+      <w:r>
         <w:lastRenderedPageBreak/>
-        <w:t>سواء أكانت ضوئية أو يدوية وعلى كل قائد أن يضع مركبته أو حيواناته أقرب ما يمكن من الحافة اليمنى لنهر الطريق وموازية له ما لم تسمح المنطقة المسموح بالإنتظار فيها بغير ذلك . ويجوز التوقف أو الإنتظار بالقرب من الحافة اليسرى عندما يكون الجانب الأيمن ممنوعا بواسطة علامات المرور أو لوجود خطوط سكك حديدية وكذلك عندما يكون التوقف أو الإنتظار فى طريق ذو إتجاه واحد مسموحا فيه بالإنتظار على الجانب الأيسر وممنوعا على الجانب الأيمن كما يجوز التوقف أو الإنتظار فى وسط نهر الطريق وفى بعض الأماكن المحددة بعلامات تشير إلى ذلك</w:t>
-      </w:r>
-      <w:r>
-        <w:t>.</w:t>
-      </w:r>
-    </w:p>
-    <w:p>
-      <w:pPr>
-        <w:jc w:val="right"/>
-      </w:pPr>
-      <w:r>
-        <w:br/>
-      </w:r>
-      <w:r>
-        <w:rPr>
-          <w:b/>
-          <w:bCs/>
-          <w:rtl/>
-        </w:rPr>
-        <w:t>مادة</w:t>
-      </w:r>
-      <w:r>
-        <w:rPr>
-          <w:b/>
-          <w:bCs/>
-        </w:rPr>
-        <w:t xml:space="preserve"> ( 64)</w:t>
-      </w:r>
-      <w:r>
-        <w:br/>
-      </w:r>
-      <w:r>
-        <w:rPr>
-          <w:rtl/>
-        </w:rPr>
-        <w:t>يجب أن يكون توقف أو إنتظار المركبات أو الحيوانات فى خارج المدن وفى المناطق غير المأهولة فى أقصى يمين نهر الطريق فى إتجاه حركة المرور مع تجنب أقسام الطريق المخصصة لسير الدراجات والأماكن المخصصة لسير الدراجات والأماكن المخصصة لمرور المشاة .وعلى قائد المركبة فى حالة إضطراره لإيقافها فى نهر الطريق إستخدام إشارة التحذير الضوئية وعلامة تحذيرية عاكسة لقائدى المركبات المقتربة بحيث تكون هذه الإشارة مرئية على مسافة كافية وخاصة عندما يكون التوقف ليلا أو فى مكان ممنوع التوقف فيه</w:t>
-      </w:r>
-      <w:r>
-        <w:t>.</w:t>
-      </w:r>
-    </w:p>
-    <w:p>
-      <w:pPr>
-        <w:jc w:val="right"/>
-      </w:pPr>
-      <w:r>
-        <w:br/>
-      </w:r>
-      <w:r>
-        <w:rPr>
-          <w:b/>
-          <w:bCs/>
-          <w:rtl/>
-        </w:rPr>
-        <w:t>مادة</w:t>
-      </w:r>
-      <w:r>
-        <w:rPr>
-          <w:b/>
-          <w:bCs/>
-        </w:rPr>
-        <w:t xml:space="preserve"> ( 65)</w:t>
-      </w:r>
-      <w:r>
-        <w:br/>
-      </w:r>
-      <w:r>
-        <w:rPr>
-          <w:rtl/>
-        </w:rPr>
-        <w:t>لا يجوز بأية حال التوقف بالمركبة على بعد يقل عن خمسة أمتار من مفارق الطرق ومداخل الميادين وأماكن عبور المشاة ومحطات مركبات النقل العام للركاب والمزلقانات</w:t>
-      </w:r>
-      <w:r>
-        <w:t>.</w:t>
-      </w:r>
-    </w:p>
-    <w:p>
-      <w:pPr>
-        <w:jc w:val="right"/>
-      </w:pPr>
-      <w:r>
-        <w:br/>
-      </w:r>
-      <w:r>
-        <w:rPr>
-          <w:b/>
-          <w:bCs/>
-          <w:rtl/>
-        </w:rPr>
-        <w:t>مادة</w:t>
-      </w:r>
-      <w:r>
-        <w:rPr>
-          <w:b/>
-          <w:bCs/>
-        </w:rPr>
-        <w:t xml:space="preserve"> ( 66)</w:t>
-      </w:r>
-      <w:r>
-        <w:br/>
-      </w:r>
-      <w:r>
-        <w:rPr>
-          <w:rtl/>
-        </w:rPr>
-        <w:t>يكون إنتظار المركبات فى الأماكن المخصصة لذلك وفى صف منتظم وفى إتجاه حركة المرور .ولا يجوز الإنتظار إلا فى الأماكن المسموح الإنتظار فيها وبما لا يقل عن خمسة أمتار من مفارق الطرق ومداخل الميادين وأماكن عبور المشاة ومحطات مركبات النقل العام للركاب والمزلقانات</w:t>
-      </w:r>
-      <w:r>
-        <w:t>.</w:t>
-      </w:r>
-    </w:p>
-    <w:p>
-      <w:pPr>
-        <w:jc w:val="right"/>
-      </w:pPr>
-      <w:r>
-        <w:br/>
-      </w:r>
-      <w:r>
-        <w:rPr>
-          <w:b/>
-          <w:bCs/>
-          <w:rtl/>
-        </w:rPr>
-        <w:t>مادة</w:t>
-      </w:r>
-      <w:r>
-        <w:rPr>
-          <w:b/>
-          <w:bCs/>
-        </w:rPr>
-        <w:t xml:space="preserve"> ( 67)</w:t>
-      </w:r>
-      <w:r>
-        <w:br/>
-      </w:r>
-      <w:r>
-        <w:rPr>
-          <w:rtl/>
-        </w:rPr>
-        <w:t>فى جميع الأحوال يجب أن يكون التوقف أو الإنتظار بحيث لا يؤدى إلى إعاقة المرور بالطريق أو إعاقة الرؤية فيه</w:t>
-      </w:r>
-      <w:r>
-        <w:t>.</w:t>
-      </w:r>
-    </w:p>
-    <w:p>
-      <w:pPr>
-        <w:jc w:val="right"/>
-      </w:pPr>
-      <w:r>
         <w:br/>
       </w:r>
       <w:r>
@@ -4482,19 +4313,165 @@
         <w:rPr>
           <w:rtl/>
         </w:rPr>
+        <w:t>فى الأماكن غير المصرح بالإنتظار فيها طبقا لتعليمات المرور</w:t>
+      </w:r>
+    </w:p>
+    <w:p>
+      <w:pPr>
+        <w:jc w:val="right"/>
+      </w:pPr>
+    </w:p>
+    <w:p>
+      <w:pPr>
+        <w:jc w:val="right"/>
+      </w:pPr>
+      <w:r>
+        <w:rPr>
+          <w:b/>
+          <w:bCs/>
+          <w:rtl/>
+        </w:rPr>
+        <w:t>مادة</w:t>
+      </w:r>
+      <w:r>
+        <w:rPr>
+          <w:b/>
+          <w:bCs/>
+        </w:rPr>
+        <w:t xml:space="preserve"> ( 69)</w:t>
+      </w:r>
+      <w:r>
+        <w:br/>
+      </w:r>
+      <w:r>
+        <w:rPr>
+          <w:rtl/>
+        </w:rPr>
+        <w:t>على مركبات النقل العام عند وقوفها بمحطاتها لركوب الركاب أو نزولهم أن تقف ملاصقة لرصيف المحطة فلا يجوز للمركبات الأخرى المرور بين المركبة ورصيف المحطة أما إذا كان هذا الرصيف جزيرة فى وسط الطريق فيكون المرور على يمينها وبسرعة هادئة وعلى وجه لا يعرض الركاب للخطر ويجب عند اللزوم التوقف ، ولا يجوز تعطيل صعود الركاب أو نزولهم أو إزعاجهم فى ذلك ويكون إنتظار الركاب فى الأماكن المخصصة لهم بالمحطة على رصيف الطريق لا فى نهره أو على أقصى جانب الطريق عند عدم وجود رصيف أو على الجزيرة المخصصة لهم</w:t>
+      </w:r>
+      <w:r>
+        <w:t xml:space="preserve"> .</w:t>
+      </w:r>
+    </w:p>
+    <w:p>
+      <w:pPr>
+        <w:jc w:val="right"/>
+      </w:pPr>
+      <w:r>
+        <w:br/>
+      </w:r>
+      <w:r>
+        <w:rPr>
+          <w:b/>
+          <w:bCs/>
+          <w:rtl/>
+        </w:rPr>
+        <w:t>مادة</w:t>
+      </w:r>
+      <w:r>
+        <w:rPr>
+          <w:b/>
+          <w:bCs/>
+        </w:rPr>
+        <w:t xml:space="preserve"> ( 70)</w:t>
+      </w:r>
+      <w:r>
+        <w:br/>
+      </w:r>
+      <w:r>
+        <w:rPr>
+          <w:rtl/>
+        </w:rPr>
+        <w:t>على قائد المركبة تهدئة السرعة أو التوقف إذا لزم الأمر للسماح للسيارات المخصصة لنقل الطلبة لإجراء التحركات اللازمة لصعودهم أو نزولهم ولا يجوز تعطيل صعود هؤلاء الركاب أو نزولهم أو إزعاجهم فى ذلك</w:t>
+      </w:r>
+      <w:r>
+        <w:t>.</w:t>
+      </w:r>
+    </w:p>
+    <w:p>
+      <w:pPr>
+        <w:jc w:val="right"/>
+      </w:pPr>
+      <w:r>
+        <w:br/>
+      </w:r>
+      <w:r>
+        <w:rPr>
+          <w:b/>
+          <w:bCs/>
+          <w:rtl/>
+        </w:rPr>
+        <w:t>مادة</w:t>
+      </w:r>
+      <w:r>
+        <w:rPr>
+          <w:b/>
+          <w:bCs/>
+        </w:rPr>
+        <w:t xml:space="preserve"> ( 71)</w:t>
+      </w:r>
+      <w:r>
+        <w:br/>
+      </w:r>
+      <w:r>
+        <w:rPr>
+          <w:rtl/>
+        </w:rPr>
+        <w:t>يحظر على قائد إحدى السيارات الأجرة أو عربات الركوب ( الحنطور ) الإنتظار بمركبته فى غير أماكن الوقوف ( المواقف ) التى يحددها قسم المرور المختص ويعلن فى هذه المواقف عنها وعن حدودها وعن عدد المركبات التى يسمح لها بإستعمالها وأوقات الإستعمال .كما يحظر عليه التجول بمركبته للبحث عن ركاب فى غير المواقف المخصصة له ، ومع ذلك يجوز له التوقف بصفة عارضة فى أقصى يمين الطريق لقبول ركاب أو إنزالهم على أن يراعى ألا يكون إنعطافه إلى يمين الطريق فجأة أو على وجه يعرض المشاة أو المركبات أو يعرضه هو نفسه لأى خطر</w:t>
+      </w:r>
+      <w:r>
+        <w:t xml:space="preserve"> .</w:t>
+      </w:r>
+    </w:p>
+    <w:p>
+      <w:pPr>
+        <w:jc w:val="right"/>
+      </w:pPr>
+      <w:r>
+        <w:br/>
+      </w:r>
+      <w:r>
+        <w:rPr>
+          <w:b/>
+          <w:bCs/>
+          <w:rtl/>
+        </w:rPr>
+        <w:t>مادة</w:t>
+      </w:r>
+      <w:r>
+        <w:rPr>
+          <w:b/>
+          <w:bCs/>
+        </w:rPr>
+        <w:t xml:space="preserve"> ( 72)</w:t>
+      </w:r>
+      <w:r>
+        <w:br/>
+      </w:r>
+      <w:r>
+        <w:rPr>
+          <w:rtl/>
+        </w:rPr>
+        <w:t xml:space="preserve">يجوز لقسم المرور المختص رفع المركبات من الأماكن الممنوع فيها الإنتظار أو من الأماكن التى من شأن تواجدها فيها إعاقة حركة المرور أو تعرضها للخطر وإيداع هذه المركبات فى مكان مخصص لهذا الغرض مع إخطار مالك المركبة بمكان إيوائها </w:t>
+      </w:r>
+      <w:r>
+        <w:rPr>
+          <w:rtl/>
+        </w:rPr>
         <w:lastRenderedPageBreak/>
-        <w:t>فى الأماكن غير المصرح بالإنتظار فيها طبقا لتعليمات المرور</w:t>
-      </w:r>
-    </w:p>
-    <w:p>
-      <w:pPr>
-        <w:jc w:val="right"/>
-      </w:pPr>
-    </w:p>
-    <w:p>
-      <w:pPr>
-        <w:jc w:val="right"/>
-      </w:pPr>
+        <w:t>ويلزم بقيمة تكاليف الرفع والإيواء التى يحددها المجلس الشعبى المحلى وذلك بما لا يجاوز خمسة وعشرون جنيها .فإذا زادت مدة الإيواء عن يومين إستحق عن كل يوم أو أجزاء اليوم أجر إيواء فى حدود جنيه واحد يوميا</w:t>
+      </w:r>
+      <w:r>
+        <w:t xml:space="preserve"> .</w:t>
+      </w:r>
+    </w:p>
+    <w:p>
+      <w:pPr>
+        <w:jc w:val="right"/>
+      </w:pPr>
+      <w:r>
+        <w:br/>
+      </w:r>
       <w:r>
         <w:rPr>
           <w:b/>
@@ -4508,28 +4485,49 @@
           <w:b/>
           <w:bCs/>
         </w:rPr>
-        <w:t xml:space="preserve"> ( 69)</w:t>
-      </w:r>
-      <w:r>
-        <w:br/>
-      </w:r>
-      <w:r>
-        <w:rPr>
-          <w:rtl/>
-        </w:rPr>
-        <w:t>على مركبات النقل العام عند وقوفها بمحطاتها لركوب الركاب أو نزولهم أن تقف ملاصقة لرصيف المحطة فلا يجوز للمركبات الأخرى المرور بين المركبة ورصيف المحطة أما إذا كان هذا الرصيف جزيرة فى وسط الطريق فيكون المرور على يمينها وبسرعة هادئة وعلى وجه لا يعرض الركاب للخطر ويجب عند اللزوم التوقف ، ولا يجوز تعطيل صعود الركاب أو نزولهم أو إزعاجهم فى ذلك ويكون إنتظار الركاب فى الأماكن المخصصة لهم بالمحطة على رصيف الطريق لا فى نهره أو على أقصى جانب الطريق عند عدم وجود رصيف أو على الجزيرة المخصصة لهم</w:t>
+        <w:t xml:space="preserve"> ( 73)</w:t>
+      </w:r>
+      <w:r>
+        <w:br/>
+      </w:r>
+      <w:r>
+        <w:rPr>
+          <w:rtl/>
+        </w:rPr>
+        <w:t>يجب إيواء المركبات أو وضعها فى الأماكن المعدة لذلك ويحظر تركها مهملة فى أى مكان فى الطريق .وتعتبر متروكة من صاحبها المركبة أو أنقاض المركبة المهملة على الطريق والباقية على هذه الحالة مدة 48 ساعة من تاريخ إخطار قسم المرور المختص للمسئول عنها بمحضر ضبط الواقعة الذى يثبت فيه أوصاف المركبة ومكان وساعة تواجدها وإسم مالكها إذا كان معروفا ورقم لوحات المركبة إذا كانت ما تزال مثبتة عليها وسائر الظروف المحيطة بها .ويكون الإخطار إلى مالك المركبة أو إنقاضها أو الحائز لها أو حارسها أو المسئول عنها فإذا لم يتم رفع المركبة أو أنقاضها خلال هذه المدة أخطر المجلس المحلى المختص الذى له عندئذ إما إتلاف المركبة أو الأنقاض موضوع المخالفة وأما رفعها ووضعها فى مكان خاص على نفقة المالك أو بيعها لحساب صاحبها بالمزاد العلنى ويخصم من ثمن البيع جميع النفقات التى تترتب من جراء هذه العملية وكذلك تكاليف رفع هذه المركبة أو الأنقاض التى يحددها المجلس المحلى المختص .أما إذا لم تف قيمة بيع المتروكات لتغطية النفقات فيحصل الفرق من المالك بالطرق المقررة قانونا</w:t>
       </w:r>
       <w:r>
         <w:t xml:space="preserve"> .</w:t>
       </w:r>
-    </w:p>
-    <w:p>
-      <w:pPr>
-        <w:jc w:val="right"/>
-      </w:pPr>
-      <w:r>
-        <w:br/>
-      </w:r>
+      <w:r>
+        <w:br/>
+      </w:r>
+    </w:p>
+    <w:p>
+      <w:pPr>
+        <w:jc w:val="right"/>
+      </w:pPr>
+      <w:r>
+        <w:br/>
+      </w:r>
+    </w:p>
+    <w:p>
+      <w:pPr>
+        <w:jc w:val="right"/>
+      </w:pPr>
+      <w:r>
+        <w:br/>
+      </w:r>
+    </w:p>
+    <w:p>
+      <w:pPr>
+        <w:jc w:val="right"/>
+      </w:pPr>
+    </w:p>
+    <w:p>
+      <w:pPr>
+        <w:jc w:val="right"/>
+      </w:pPr>
       <w:r>
         <w:rPr>
           <w:b/>
@@ -4543,16 +4541,16 @@
           <w:b/>
           <w:bCs/>
         </w:rPr>
-        <w:t xml:space="preserve"> ( 70)</w:t>
-      </w:r>
-      <w:r>
-        <w:br/>
-      </w:r>
-      <w:r>
-        <w:rPr>
-          <w:rtl/>
-        </w:rPr>
-        <w:t>على قائد المركبة تهدئة السرعة أو التوقف إذا لزم الأمر للسماح للسيارات المخصصة لنقل الطلبة لإجراء التحركات اللازمة لصعودهم أو نزولهم ولا يجوز تعطيل صعود هؤلاء الركاب أو نزولهم أو إزعاجهم فى ذلك</w:t>
+        <w:t xml:space="preserve"> ( 74)</w:t>
+      </w:r>
+      <w:r>
+        <w:br/>
+      </w:r>
+      <w:r>
+        <w:rPr>
+          <w:rtl/>
+        </w:rPr>
+        <w:t>على كل قائد مركبة يسير على طرق مجهزة أو غير مجهزة بالإنارة العامة أن يستخدم أنوار مركبته أثناء الليل ( بين الغروب والشروق ) وكذلك فى النهار عندما تكون الرؤية غير كافية لأى سبب كالضباب أو سقوط الرعد أو هطول الأمطار الغزيرة أو المرور فى أحد الأنفاق مما يسبب عدم رؤية المركبة إذا لم تكشف أنوارها عن مكان وجودها</w:t>
       </w:r>
       <w:r>
         <w:t>.</w:t>
@@ -4578,16 +4576,86 @@
           <w:b/>
           <w:bCs/>
         </w:rPr>
-        <w:t xml:space="preserve"> ( 71)</w:t>
-      </w:r>
-      <w:r>
-        <w:br/>
-      </w:r>
-      <w:r>
-        <w:rPr>
-          <w:rtl/>
-        </w:rPr>
-        <w:t>يحظر على قائد إحدى السيارات الأجرة أو عربات الركوب ( الحنطور ) الإنتظار بمركبته فى غير أماكن الوقوف ( المواقف ) التى يحددها قسم المرور المختص ويعلن فى هذه المواقف عنها وعن حدودها وعن عدد المركبات التى يسمح لها بإستعمالها وأوقات الإستعمال .كما يحظر عليه التجول بمركبته للبحث عن ركاب فى غير المواقف المخصصة له ، ومع ذلك يجوز له التوقف بصفة عارضة فى أقصى يمين الطريق لقبول ركاب أو إنزالهم على أن يراعى ألا يكون إنعطافه إلى يمين الطريق فجأة أو على وجه يعرض المشاة أو المركبات أو يعرضه هو نفسه لأى خطر</w:t>
+        <w:t xml:space="preserve"> ( 75) </w:t>
+      </w:r>
+      <w:r>
+        <w:br/>
+      </w:r>
+      <w:r>
+        <w:rPr>
+          <w:rtl/>
+        </w:rPr>
+        <w:t>على كل قائد مركبة متوقفة أثناء الليل على الطرق عندما تكون الرؤية غير كافية أن يعلن عن وجود مركبته بواسطة إضاءة أنوار المواضع اللازمة الموجودة بالمركبة ووضع العلامة التحذيرية العاكسة</w:t>
+      </w:r>
+      <w:r>
+        <w:t>.</w:t>
+      </w:r>
+    </w:p>
+    <w:p>
+      <w:pPr>
+        <w:jc w:val="right"/>
+      </w:pPr>
+      <w:r>
+        <w:br/>
+      </w:r>
+      <w:r>
+        <w:rPr>
+          <w:b/>
+          <w:bCs/>
+          <w:rtl/>
+        </w:rPr>
+        <w:t>مادة</w:t>
+      </w:r>
+      <w:r>
+        <w:rPr>
+          <w:b/>
+          <w:bCs/>
+        </w:rPr>
+        <w:t xml:space="preserve"> (76)</w:t>
+      </w:r>
+      <w:r>
+        <w:br/>
+      </w:r>
+      <w:r>
+        <w:rPr>
+          <w:rtl/>
+        </w:rPr>
+        <w:t>مع عدم الإخلال بالتدابير المقررة فى هذا القانون أو بأية عقوبة أشد فى أى قانون آخر يعاقب بالحبس مدة لا تزيد على ثلاثة أشهر وبغرامة لا تقل عن خمسمائة جنيه ولا تزيد على ألف جنيه أو بإحدى هاتين العقوبتين كل من حاز فى السيارة أو إستعمل فيها أجهزة تنذر أو تكشف مواقع أجهزة قياس سرعة المركبات أو تؤثر على عملها كما يتم ضبط تلك الأجهزة وتقضى المحكمة بمصادرتها</w:t>
+      </w:r>
+      <w:r>
+        <w:t>.</w:t>
+      </w:r>
+    </w:p>
+    <w:p>
+      <w:pPr>
+        <w:jc w:val="right"/>
+      </w:pPr>
+      <w:r>
+        <w:br/>
+      </w:r>
+      <w:r>
+        <w:rPr>
+          <w:b/>
+          <w:bCs/>
+          <w:rtl/>
+        </w:rPr>
+        <w:t>مادة</w:t>
+      </w:r>
+      <w:r>
+        <w:rPr>
+          <w:b/>
+          <w:bCs/>
+        </w:rPr>
+        <w:t xml:space="preserve"> (77) </w:t>
+      </w:r>
+      <w:r>
+        <w:br/>
+      </w:r>
+      <w:r>
+        <w:rPr>
+          <w:rtl/>
+        </w:rPr>
+        <w:t>على قائد المركبات عدم إستخدام أنوار حمراء أو أجهزة أو أية مواد عاكسة حمراء فى مقدمة المركبة وكذلك عدم إستخدام أنوار بيضاء أو صفراء كاشفة أو أية مواد عاكسة غير حمراء فى مؤخرة المركبة</w:t>
       </w:r>
       <w:r>
         <w:t xml:space="preserve"> .</w:t>
@@ -4613,19 +4681,19 @@
           <w:b/>
           <w:bCs/>
         </w:rPr>
-        <w:t xml:space="preserve"> ( 72)</w:t>
-      </w:r>
-      <w:r>
-        <w:br/>
-      </w:r>
-      <w:r>
-        <w:rPr>
-          <w:rtl/>
-        </w:rPr>
-        <w:t>يجوز لقسم المرور المختص رفع المركبات من الأماكن الممنوع فيها الإنتظار أو من الأماكن التى من شأن تواجدها فيها إعاقة حركة المرور أو تعرضها للخطر وإيداع هذه المركبات فى مكان مخصص لهذا الغرض مع إخطار مالك المركبة بمكان إيوائها ويلزم بقيمة تكاليف الرفع والإيواء التى يحددها المجلس الشعبى المحلى وذلك بما لا يجاوز خمسة وعشرون جنيها .فإذا زادت مدة الإيواء عن يومين إستحق عن كل يوم أو أجزاء اليوم أجر إيواء فى حدود جنيه واحد يوميا</w:t>
-      </w:r>
-      <w:r>
-        <w:t xml:space="preserve"> .</w:t>
+        <w:t xml:space="preserve"> ( 78)</w:t>
+      </w:r>
+      <w:r>
+        <w:br/>
+      </w:r>
+      <w:r>
+        <w:rPr>
+          <w:rtl/>
+        </w:rPr>
+        <w:t>على مواكب المشاة وعلى قائدى الماشية سواء كانت فردية أو فى شكل قطعان وكذلك قائدى حيوانات الجر والحمل والركوب إستخدام أنوار أو أجهزة عاكسة عند إنتقالهم ليلا على طول نهر الطريق</w:t>
+      </w:r>
+      <w:r>
+        <w:t>.</w:t>
       </w:r>
     </w:p>
     <w:p>
@@ -4648,253 +4716,6 @@
           <w:b/>
           <w:bCs/>
         </w:rPr>
-        <w:t xml:space="preserve"> ( 73)</w:t>
-      </w:r>
-      <w:r>
-        <w:br/>
-      </w:r>
-      <w:r>
-        <w:rPr>
-          <w:rtl/>
-        </w:rPr>
-        <w:t>يجب إيواء المركبات أو وضعها فى الأماكن المعدة لذلك ويحظر تركها مهملة فى أى مكان فى الطريق .وتعتبر متروكة من صاحبها المركبة أو أنقاض المركبة المهملة على الطريق والباقية على هذه الحالة مدة 48 ساعة من تاريخ إخطار قسم المرور المختص للمسئول عنها بمحضر ضبط الواقعة الذى يثبت فيه أوصاف المركبة ومكان وساعة تواجدها وإسم مالكها إذا كان معروفا ورقم لوحات المركبة إذا كانت ما تزال مثبتة عليها وسائر الظروف المحيطة بها .ويكون الإخطار إلى مالك المركبة أو إنقاضها أو الحائز لها أو حارسها أو المسئول عنها فإذا لم يتم رفع المركبة أو أنقاضها خلال هذه المدة أخطر المجلس المحلى المختص الذى له عندئذ إما إتلاف المركبة أو الأنقاض موضوع المخالفة وأما رفعها ووضعها فى مكان خاص على نفقة المالك أو بيعها لحساب صاحبها بالمزاد العلنى ويخصم من ثمن البيع جميع النفقات التى تترتب من جراء هذه العملية وكذلك تكاليف رفع هذه المركبة أو الأنقاض التى يحددها المجلس المحلى المختص .أما إذا لم تف قيمة بيع المتروكات لتغطية النفقات فيحصل الفرق من المالك بالطرق المقررة قانونا</w:t>
-      </w:r>
-      <w:r>
-        <w:t xml:space="preserve"> .</w:t>
-      </w:r>
-      <w:r>
-        <w:br/>
-      </w:r>
-    </w:p>
-    <w:p>
-      <w:pPr>
-        <w:jc w:val="right"/>
-      </w:pPr>
-      <w:r>
-        <w:br/>
-      </w:r>
-    </w:p>
-    <w:p>
-      <w:pPr>
-        <w:jc w:val="right"/>
-      </w:pPr>
-      <w:r>
-        <w:br/>
-      </w:r>
-    </w:p>
-    <w:p>
-      <w:pPr>
-        <w:jc w:val="right"/>
-      </w:pPr>
-      <w:r>
-        <w:rPr>
-          <w:b/>
-          <w:bCs/>
-          <w:rtl/>
-        </w:rPr>
-        <w:t>عاشرا:الاشارة</w:t>
-      </w:r>
-      <w:r>
-        <w:br/>
-      </w:r>
-    </w:p>
-    <w:p>
-      <w:pPr>
-        <w:jc w:val="right"/>
-      </w:pPr>
-    </w:p>
-    <w:p>
-      <w:pPr>
-        <w:jc w:val="right"/>
-      </w:pPr>
-      <w:r>
-        <w:rPr>
-          <w:b/>
-          <w:bCs/>
-          <w:rtl/>
-        </w:rPr>
-        <w:t>مادة</w:t>
-      </w:r>
-      <w:r>
-        <w:rPr>
-          <w:b/>
-          <w:bCs/>
-        </w:rPr>
-        <w:t xml:space="preserve"> ( 74)</w:t>
-      </w:r>
-      <w:r>
-        <w:br/>
-      </w:r>
-      <w:r>
-        <w:rPr>
-          <w:rtl/>
-        </w:rPr>
-        <w:t>على كل قائد مركبة يسير على طرق مجهزة أو غير مجهزة بالإنارة العامة أن يستخدم أنوار مركبته أثناء الليل ( بين الغروب والشروق ) وكذلك فى النهار عندما تكون الرؤية غير كافية لأى سبب كالضباب أو سقوط الرعد أو هطول الأمطار الغزيرة أو المرور فى أحد الأنفاق مما يسبب عدم رؤية المركبة إذا لم تكشف أنوارها عن مكان وجودها</w:t>
-      </w:r>
-      <w:r>
-        <w:t>.</w:t>
-      </w:r>
-    </w:p>
-    <w:p>
-      <w:pPr>
-        <w:jc w:val="right"/>
-      </w:pPr>
-      <w:r>
-        <w:br/>
-      </w:r>
-      <w:r>
-        <w:rPr>
-          <w:b/>
-          <w:bCs/>
-          <w:rtl/>
-        </w:rPr>
-        <w:t>مادة</w:t>
-      </w:r>
-      <w:r>
-        <w:rPr>
-          <w:b/>
-          <w:bCs/>
-        </w:rPr>
-        <w:t xml:space="preserve"> ( 75) </w:t>
-      </w:r>
-      <w:r>
-        <w:br/>
-      </w:r>
-      <w:r>
-        <w:rPr>
-          <w:rtl/>
-        </w:rPr>
-        <w:t>على كل قائد مركبة متوقفة أثناء الليل على الطرق عندما تكون الرؤية غير كافية أن يعلن عن وجود مركبته بواسطة إضاءة أنوار المواضع اللازمة الموجودة بالمركبة ووضع العلامة التحذيرية العاكسة</w:t>
-      </w:r>
-      <w:r>
-        <w:t>.</w:t>
-      </w:r>
-    </w:p>
-    <w:p>
-      <w:pPr>
-        <w:jc w:val="right"/>
-      </w:pPr>
-      <w:r>
-        <w:br/>
-      </w:r>
-      <w:r>
-        <w:rPr>
-          <w:b/>
-          <w:bCs/>
-          <w:rtl/>
-        </w:rPr>
-        <w:t>مادة</w:t>
-      </w:r>
-      <w:r>
-        <w:rPr>
-          <w:b/>
-          <w:bCs/>
-        </w:rPr>
-        <w:t xml:space="preserve"> (76)</w:t>
-      </w:r>
-      <w:r>
-        <w:br/>
-      </w:r>
-      <w:r>
-        <w:rPr>
-          <w:rtl/>
-        </w:rPr>
-        <w:t>مع عدم الإخلال بالتدابير المقررة فى هذا القانون أو بأية عقوبة أشد فى أى قانون آخر يعاقب بالحبس مدة لا تزيد على ثلاثة أشهر وبغرامة لا تقل عن خمسمائة جنيه ولا تزيد على ألف جنيه أو بإحدى هاتين العقوبتين كل من حاز فى السيارة أو إستعمل فيها أجهزة تنذر أو تكشف مواقع أجهزة قياس سرعة المركبات أو تؤثر على عملها كما يتم ضبط تلك الأجهزة وتقضى المحكمة بمصادرتها</w:t>
-      </w:r>
-      <w:r>
-        <w:t>.</w:t>
-      </w:r>
-    </w:p>
-    <w:p>
-      <w:pPr>
-        <w:jc w:val="right"/>
-      </w:pPr>
-      <w:r>
-        <w:br/>
-      </w:r>
-      <w:r>
-        <w:rPr>
-          <w:b/>
-          <w:bCs/>
-          <w:rtl/>
-        </w:rPr>
-        <w:t>مادة</w:t>
-      </w:r>
-      <w:r>
-        <w:rPr>
-          <w:b/>
-          <w:bCs/>
-        </w:rPr>
-        <w:t xml:space="preserve"> (77) </w:t>
-      </w:r>
-      <w:r>
-        <w:br/>
-      </w:r>
-      <w:r>
-        <w:rPr>
-          <w:rtl/>
-        </w:rPr>
-        <w:t>على قائد المركبات عدم إستخدام أنوار حمراء أو أجهزة أو أية مواد عاكسة حمراء فى مقدمة المركبة وكذلك عدم إستخدام أنوار بيضاء أو صفراء كاشفة أو أية مواد عاكسة غير حمراء فى مؤخرة المركبة</w:t>
-      </w:r>
-      <w:r>
-        <w:t xml:space="preserve"> .</w:t>
-      </w:r>
-    </w:p>
-    <w:p>
-      <w:pPr>
-        <w:jc w:val="right"/>
-      </w:pPr>
-      <w:r>
-        <w:br/>
-      </w:r>
-      <w:r>
-        <w:rPr>
-          <w:b/>
-          <w:bCs/>
-          <w:rtl/>
-        </w:rPr>
-        <w:t>مادة</w:t>
-      </w:r>
-      <w:r>
-        <w:rPr>
-          <w:b/>
-          <w:bCs/>
-        </w:rPr>
-        <w:t xml:space="preserve"> ( 78)</w:t>
-      </w:r>
-      <w:r>
-        <w:br/>
-      </w:r>
-      <w:r>
-        <w:rPr>
-          <w:rtl/>
-        </w:rPr>
-        <w:t>على مواكب المشاة وعلى قائدى الماشية سواء كانت فردية أو فى شكل قطعان وكذلك قائدى حيوانات الجر والحمل والركوب إستخدام أنوار أو أجهزة عاكسة عند إنتقالهم ليلا على طول نهر الطريق</w:t>
-      </w:r>
-      <w:r>
-        <w:t>.</w:t>
-      </w:r>
-    </w:p>
-    <w:p>
-      <w:pPr>
-        <w:jc w:val="right"/>
-      </w:pPr>
-      <w:r>
-        <w:br/>
-      </w:r>
-      <w:r>
-        <w:rPr>
-          <w:b/>
-          <w:bCs/>
-          <w:rtl/>
-        </w:rPr>
-        <w:t>مادة</w:t>
-      </w:r>
-      <w:r>
-        <w:rPr>
-          <w:b/>
-          <w:bCs/>
-        </w:rPr>
         <w:t xml:space="preserve"> ( 79)</w:t>
       </w:r>
       <w:r>
@@ -4904,6 +4725,7 @@
         <w:rPr>
           <w:rtl/>
         </w:rPr>
+        <w:lastRenderedPageBreak/>
         <w:t>لا يجوز لقائد مركبة مجهزة بنور خاص للسير إلى الخلف إضاءة هذا النور إلا عند إعتزامه السير إلى الخلف وأثناء ذلك مع مراعاة عدم مضايقة باقى مستعملى الطريق وعلى أن يتم إطفاؤه بمجرد التوقف</w:t>
       </w:r>
       <w:r>
@@ -5042,7 +4864,6 @@
         <w:rPr>
           <w:rtl/>
         </w:rPr>
-        <w:lastRenderedPageBreak/>
         <w:t>فى الحالات الممنوع فيها إستعمال أنوار القيادة وتكون أنوار الموضع غير كافية للسماح لقائد المركبة بأن يرى بوضوح وعلى مسافة كافية</w:t>
       </w:r>
     </w:p>
@@ -5165,22 +4986,6 @@
       <w:pPr>
         <w:jc w:val="right"/>
       </w:pPr>
-      <w:r>
-        <w:rPr>
-          <w:b/>
-          <w:bCs/>
-          <w:rtl/>
-        </w:rPr>
-        <w:t>الحادى عشر:حمولة المركبات</w:t>
-      </w:r>
-      <w:r>
-        <w:br/>
-      </w:r>
-    </w:p>
-    <w:p>
-      <w:pPr>
-        <w:jc w:val="right"/>
-      </w:pPr>
     </w:p>
     <w:p>
       <w:pPr>
@@ -5208,7 +5013,14 @@
         <w:rPr>
           <w:rtl/>
         </w:rPr>
-        <w:t>لا يكون تحميل المركبات أو تفريغ حمولتها فى الطرق إلا بصفة عارضة وبشرط عدم وجود إمكانية أخرى لغير ذلك وفى هذه الحالة يجب أن يتم التحميل أو التفريغ فى غير تراخى وبدون تعريض أمن الطريق أو المشاة للخطر أو إعاقة حركة المرور .ويجوز لقسم المرور المختص حيث تتطلب الضرورة ذلك منح ترخيص خاص يجيز التفريغ والتحميل فى أماكن معينة وفى الأوقات التى يحددها</w:t>
+        <w:t xml:space="preserve">لا يكون تحميل المركبات أو تفريغ حمولتها فى الطرق إلا بصفة عارضة وبشرط عدم وجود إمكانية أخرى لغير ذلك وفى هذه الحالة يجب أن يتم التحميل أو التفريغ فى غير تراخى وبدون تعريض أمن الطريق أو المشاة للخطر أو إعاقة حركة المرور .ويجوز </w:t>
+      </w:r>
+      <w:r>
+        <w:rPr>
+          <w:rtl/>
+        </w:rPr>
+        <w:lastRenderedPageBreak/>
+        <w:t>لقسم المرور المختص حيث تتطلب الضرورة ذلك منح ترخيص خاص يجيز التفريغ والتحميل فى أماكن معينة وفى الأوقات التى يحددها</w:t>
       </w:r>
       <w:r>
         <w:t>.</w:t>
@@ -5347,7 +5159,6 @@
           <w:bCs/>
           <w:rtl/>
         </w:rPr>
-        <w:lastRenderedPageBreak/>
         <w:t>مادة</w:t>
       </w:r>
       <w:r>
@@ -5550,6 +5361,7 @@
           <w:bCs/>
           <w:rtl/>
         </w:rPr>
+        <w:lastRenderedPageBreak/>
         <w:t>مادة</w:t>
       </w:r>
       <w:r>
@@ -5682,175 +5494,159 @@
         <w:jc w:val="right"/>
       </w:pPr>
       <w:r>
+        <w:br/>
+      </w:r>
+      <w:r>
+        <w:rPr>
+          <w:b/>
+          <w:bCs/>
+          <w:rtl/>
+        </w:rPr>
+        <w:t>مادة</w:t>
+      </w:r>
+      <w:r>
+        <w:rPr>
+          <w:b/>
+          <w:bCs/>
+        </w:rPr>
+        <w:t xml:space="preserve"> ( 95)</w:t>
+      </w:r>
+      <w:r>
+        <w:br/>
+      </w:r>
+      <w:r>
+        <w:rPr>
+          <w:rtl/>
+        </w:rPr>
+        <w:t>لا يجوز نقل الركاب فى مركبات النقل ولا يجوز وجود ركاب أو أشخاص فى الأماكن المخصصة للحمولة بهذه المركبات إلا بترخيص من قسم المرور إذا كان ذلك لازما لمرافقة الحمولة أو للعمل أو عند إنتقالهم لمكان عملهم أو عودتهم منه وفى هذه الحالة لا يجوز أن يزيد عددهم على ثمانية أشخاص ولقسم المرور المختص التصريح بنقل الأشخاص فى سيارات النقل وذلك خلال مدة محددة وفى خط سير معين وذلك عند الضرورة وفى حالات تقوية جسور النيل أو مقاومة دودة القطن بشرط ألا يزيد عددهم على 25 شخصا فى السيارة وأن توضع بها مقاعد لجلوسهم ويجب فى جميع الأحوال تقديم وثيقة التأمين الإجبارى عن الركاب الذين يصرح بهم ولا يجوز فى هذه الأحوال أن يكون نقل الأشخاص مقابل أجر</w:t>
+      </w:r>
+      <w:r>
+        <w:t>.</w:t>
+      </w:r>
+    </w:p>
+    <w:p>
+      <w:pPr>
+        <w:jc w:val="right"/>
+      </w:pPr>
+      <w:r>
+        <w:br/>
+      </w:r>
+      <w:r>
+        <w:rPr>
+          <w:b/>
+          <w:bCs/>
+          <w:rtl/>
+        </w:rPr>
+        <w:t>مادة</w:t>
+      </w:r>
+      <w:r>
+        <w:rPr>
+          <w:b/>
+          <w:bCs/>
+        </w:rPr>
+        <w:t xml:space="preserve"> (96)</w:t>
+      </w:r>
+      <w:r>
+        <w:br/>
+      </w:r>
+      <w:r>
+        <w:rPr>
+          <w:rtl/>
+        </w:rPr>
+        <w:t>لا يجوز أى من مركبات النقل السريع عموما بما فيها السيارات الخاصة أو عربات الركوب ( الحنطور ) نقل ركاب أكثر من العدد المحدد برخصتها</w:t>
+      </w:r>
+      <w:r>
+        <w:t>.</w:t>
+      </w:r>
+    </w:p>
+    <w:p>
+      <w:pPr>
+        <w:jc w:val="right"/>
+      </w:pPr>
+      <w:r>
+        <w:br/>
+      </w:r>
+      <w:r>
+        <w:rPr>
+          <w:b/>
+          <w:bCs/>
+          <w:rtl/>
+        </w:rPr>
+        <w:t>مادة</w:t>
+      </w:r>
+      <w:r>
+        <w:rPr>
+          <w:b/>
+          <w:bCs/>
+        </w:rPr>
+        <w:t xml:space="preserve"> (97)</w:t>
+      </w:r>
+      <w:r>
+        <w:br/>
+      </w:r>
+      <w:r>
+        <w:rPr>
+          <w:rtl/>
+        </w:rPr>
+        <w:t>يسمح للمركبات أن تجر خلفها وعلى مسئولية مالكها وقائدها مركبة أخرى معطلة بشرط أن يقتصر هذا القطر على رحلة واحدة وأن تكون المركبة القاطرة ذات قوة محرك لا يقل عن قوة محرك المركبة المقطورة وأن تكون خالية تماما من الأحمال أو الأشخاص عدا قائدها ولا تزيد سرعتها عن الحدود القصوى للسيارات القاطرة مع وضع العلامات التحذيرية العاكسة على المركبة المقطورة</w:t>
+      </w:r>
+      <w:r>
+        <w:t>.</w:t>
+      </w:r>
+    </w:p>
+    <w:p>
+      <w:pPr>
+        <w:jc w:val="right"/>
+      </w:pPr>
+    </w:p>
+    <w:p>
+      <w:pPr>
+        <w:jc w:val="right"/>
+      </w:pPr>
+    </w:p>
+    <w:p>
+      <w:pPr>
+        <w:jc w:val="right"/>
+      </w:pPr>
+    </w:p>
+    <w:p>
+      <w:pPr>
+        <w:jc w:val="right"/>
+      </w:pPr>
+      <w:r>
+        <w:rPr>
+          <w:b/>
+          <w:bCs/>
+          <w:rtl/>
+        </w:rPr>
+        <w:t>مادة</w:t>
+      </w:r>
+      <w:r>
+        <w:rPr>
+          <w:b/>
+          <w:bCs/>
+        </w:rPr>
+        <w:t xml:space="preserve"> (98) </w:t>
+      </w:r>
+      <w:r>
+        <w:br/>
+      </w:r>
+      <w:r>
+        <w:rPr>
+          <w:rtl/>
+        </w:rPr>
+        <w:t>يجب أن تكون السيارات الأجرة وعربات الركوب ( الحنطور ) بحالة نظيفة بإستمرار ويجب أن يكون رداء قائد أى من هذه المركبات نظيفا ، ولقسم المرور المختص بعد أخذ رأى المجالس المحلية المختصة أن يحدد زيا خاصا لهم</w:t>
+      </w:r>
+      <w:r>
+        <w:t>.</w:t>
+      </w:r>
+    </w:p>
+    <w:p>
+      <w:pPr>
+        <w:jc w:val="right"/>
+      </w:pPr>
+      <w:r>
         <w:lastRenderedPageBreak/>
-        <w:br/>
-      </w:r>
-      <w:r>
-        <w:rPr>
-          <w:b/>
-          <w:bCs/>
-          <w:rtl/>
-        </w:rPr>
-        <w:t>مادة</w:t>
-      </w:r>
-      <w:r>
-        <w:rPr>
-          <w:b/>
-          <w:bCs/>
-        </w:rPr>
-        <w:t xml:space="preserve"> ( 95)</w:t>
-      </w:r>
-      <w:r>
-        <w:br/>
-      </w:r>
-      <w:r>
-        <w:rPr>
-          <w:rtl/>
-        </w:rPr>
-        <w:t>لا يجوز نقل الركاب فى مركبات النقل ولا يجوز وجود ركاب أو أشخاص فى الأماكن المخصصة للحمولة بهذه المركبات إلا بترخيص من قسم المرور إذا كان ذلك لازما لمرافقة الحمولة أو للعمل أو عند إنتقالهم لمكان عملهم أو عودتهم منه وفى هذه الحالة لا يجوز أن يزيد عددهم على ثمانية أشخاص ولقسم المرور المختص التصريح بنقل الأشخاص فى سيارات النقل وذلك خلال مدة محددة وفى خط سير معين وذلك عند الضرورة وفى حالات تقوية جسور النيل أو مقاومة دودة القطن بشرط ألا يزيد عددهم على 25 شخصا فى السيارة وأن توضع بها مقاعد لجلوسهم ويجب فى جميع الأحوال تقديم وثيقة التأمين الإجبارى عن الركاب الذين يصرح بهم ولا يجوز فى هذه الأحوال أن يكون نقل الأشخاص مقابل أجر</w:t>
-      </w:r>
-      <w:r>
-        <w:t>.</w:t>
-      </w:r>
-    </w:p>
-    <w:p>
-      <w:pPr>
-        <w:jc w:val="right"/>
-      </w:pPr>
-      <w:r>
-        <w:br/>
-      </w:r>
-      <w:r>
-        <w:rPr>
-          <w:b/>
-          <w:bCs/>
-          <w:rtl/>
-        </w:rPr>
-        <w:t>مادة</w:t>
-      </w:r>
-      <w:r>
-        <w:rPr>
-          <w:b/>
-          <w:bCs/>
-        </w:rPr>
-        <w:t xml:space="preserve"> (96)</w:t>
-      </w:r>
-      <w:r>
-        <w:br/>
-      </w:r>
-      <w:r>
-        <w:rPr>
-          <w:rtl/>
-        </w:rPr>
-        <w:t>لا يجوز أى من مركبات النقل السريع عموما بما فيها السيارات الخاصة أو عربات الركوب ( الحنطور ) نقل ركاب أكثر من العدد المحدد برخصتها</w:t>
-      </w:r>
-      <w:r>
-        <w:t>.</w:t>
-      </w:r>
-    </w:p>
-    <w:p>
-      <w:pPr>
-        <w:jc w:val="right"/>
-      </w:pPr>
-      <w:r>
-        <w:br/>
-      </w:r>
-      <w:r>
-        <w:rPr>
-          <w:b/>
-          <w:bCs/>
-          <w:rtl/>
-        </w:rPr>
-        <w:t>مادة</w:t>
-      </w:r>
-      <w:r>
-        <w:rPr>
-          <w:b/>
-          <w:bCs/>
-        </w:rPr>
-        <w:t xml:space="preserve"> (97)</w:t>
-      </w:r>
-      <w:r>
-        <w:br/>
-      </w:r>
-      <w:r>
-        <w:rPr>
-          <w:rtl/>
-        </w:rPr>
-        <w:t>يسمح للمركبات أن تجر خلفها وعلى مسئولية مالكها وقائدها مركبة أخرى معطلة بشرط أن يقتصر هذا القطر على رحلة واحدة وأن تكون المركبة القاطرة ذات قوة محرك لا يقل عن قوة محرك المركبة المقطورة وأن تكون خالية تماما من الأحمال أو الأشخاص عدا قائدها ولا تزيد سرعتها عن الحدود القصوى للسيارات القاطرة مع وضع العلامات التحذيرية العاكسة على المركبة المقطورة</w:t>
-      </w:r>
-      <w:r>
-        <w:t>.</w:t>
-      </w:r>
-    </w:p>
-    <w:p>
-      <w:pPr>
-        <w:jc w:val="right"/>
-      </w:pPr>
-    </w:p>
-    <w:p>
-      <w:pPr>
-        <w:jc w:val="right"/>
-      </w:pPr>
-    </w:p>
-    <w:p>
-      <w:pPr>
-        <w:jc w:val="right"/>
-      </w:pPr>
-      <w:r>
-        <w:rPr>
-          <w:b/>
-          <w:bCs/>
-          <w:rtl/>
-        </w:rPr>
-        <w:t>الثانى عشر :مركبات الركوب الاجرة</w:t>
-      </w:r>
-      <w:r>
-        <w:br/>
-      </w:r>
-    </w:p>
-    <w:p>
-      <w:pPr>
-        <w:jc w:val="right"/>
-      </w:pPr>
-    </w:p>
-    <w:p>
-      <w:pPr>
-        <w:jc w:val="right"/>
-      </w:pPr>
-      <w:r>
-        <w:rPr>
-          <w:b/>
-          <w:bCs/>
-          <w:rtl/>
-        </w:rPr>
-        <w:t>مادة</w:t>
-      </w:r>
-      <w:r>
-        <w:rPr>
-          <w:b/>
-          <w:bCs/>
-        </w:rPr>
-        <w:t xml:space="preserve"> (98) </w:t>
-      </w:r>
-      <w:r>
-        <w:br/>
-      </w:r>
-      <w:r>
-        <w:rPr>
-          <w:rtl/>
-        </w:rPr>
-        <w:t>يجب أن تكون السيارات الأجرة وعربات الركوب ( الحنطور ) بحالة نظيفة بإستمرار ويجب أن يكون رداء قائد أى من هذه المركبات نظيفا ، ولقسم المرور المختص بعد أخذ رأى المجالس المحلية المختصة أن يحدد زيا خاصا لهم</w:t>
-      </w:r>
-      <w:r>
-        <w:t>.</w:t>
-      </w:r>
-    </w:p>
-    <w:p>
-      <w:pPr>
-        <w:jc w:val="right"/>
-      </w:pPr>
-      <w:r>
         <w:br/>
       </w:r>
       <w:r>
@@ -5992,7 +5788,6 @@
         <w:rPr>
           <w:rtl/>
         </w:rPr>
-        <w:lastRenderedPageBreak/>
         <w:t>بين الساعة 10 ص والساعة 12 ظهرا</w:t>
       </w:r>
     </w:p>
@@ -6268,6 +6063,7 @@
         <w:rPr>
           <w:rtl/>
         </w:rPr>
+        <w:lastRenderedPageBreak/>
         <w:t>يحظر على قائد إحدى مركبات نقل الركاب سواء السريع منها والبطئ التكلم مع أحد من الركاب أو عما ل المركبة أو السماح لأحد بالجلوس أو الوقوف بجواره أثناء السير</w:t>
       </w:r>
       <w:r>
@@ -6387,6 +6183,205 @@
         <w:jc w:val="right"/>
       </w:pPr>
       <w:r>
+        <w:br/>
+      </w:r>
+      <w:r>
+        <w:rPr>
+          <w:b/>
+          <w:bCs/>
+          <w:rtl/>
+        </w:rPr>
+        <w:t>مادة</w:t>
+      </w:r>
+      <w:r>
+        <w:rPr>
+          <w:b/>
+          <w:bCs/>
+        </w:rPr>
+        <w:t xml:space="preserve"> ( 106)</w:t>
+      </w:r>
+      <w:r>
+        <w:br/>
+      </w:r>
+      <w:r>
+        <w:rPr>
+          <w:rtl/>
+        </w:rPr>
+        <w:t>على قائد أية مركبة من مركبات الأجرة ونقل الركاب وقائدى عربات الركوب ( الحنطور ) الوقوف أمام نقطة المرور بالطرق العامة للتفتيش ويشمل التفتيش رخصهم ورخص مركباتهم وتوافر شروط الترخيص من حيث عدد الركاب أو الحمولة وما يتعلق بذلك من أحكام هذه اللائحة</w:t>
+      </w:r>
+      <w:r>
+        <w:t>. </w:t>
+      </w:r>
+      <w:r>
+        <w:br/>
+      </w:r>
+      <w:r>
+        <w:rPr>
+          <w:rtl/>
+        </w:rPr>
+        <w:t>كما يتناول التفتيش حالة الحيوان الصحية بالنسبة لمركبات النقل البطئ التى يجرها الحيوان وقدرته وتمرنه على الجر فإذا تبين أن الحيوان غير متوافر فيه شروط الصحة أو غير متمرن على الجر يمنع تشغيله إذا رأى الطبيب البيطرى ضرورة ذلك ولا يجوز إعادة تشغيله إلا بعد التصريح بذلك من نفس الطبيب بأنه لائق للتشغيل</w:t>
+      </w:r>
+      <w:r>
+        <w:t>.</w:t>
+      </w:r>
+    </w:p>
+    <w:p>
+      <w:pPr>
+        <w:jc w:val="right"/>
+      </w:pPr>
+    </w:p>
+    <w:p>
+      <w:pPr>
+        <w:jc w:val="right"/>
+      </w:pPr>
+    </w:p>
+    <w:p>
+      <w:pPr>
+        <w:jc w:val="right"/>
+      </w:pPr>
+    </w:p>
+    <w:p>
+      <w:pPr>
+        <w:jc w:val="right"/>
+      </w:pPr>
+      <w:r>
+        <w:rPr>
+          <w:b/>
+          <w:bCs/>
+          <w:rtl/>
+        </w:rPr>
+        <w:t>مادة</w:t>
+      </w:r>
+      <w:r>
+        <w:rPr>
+          <w:b/>
+          <w:bCs/>
+        </w:rPr>
+        <w:t xml:space="preserve"> ( 107) </w:t>
+      </w:r>
+      <w:r>
+        <w:br/>
+      </w:r>
+      <w:r>
+        <w:rPr>
+          <w:rtl/>
+        </w:rPr>
+        <w:t>يكون ركوب الدراجة أو النزول منها على حافة الإفريز الأيمن للطريق وعلى راكبها أن يخفف من سرعته حيث تلاقى الشوارع وعند منعطف الطريق</w:t>
+      </w:r>
+      <w:r>
+        <w:t>.</w:t>
+      </w:r>
+    </w:p>
+    <w:p>
+      <w:pPr>
+        <w:jc w:val="right"/>
+      </w:pPr>
+      <w:r>
+        <w:br/>
+      </w:r>
+      <w:r>
+        <w:rPr>
+          <w:b/>
+          <w:bCs/>
+          <w:rtl/>
+        </w:rPr>
+        <w:t>مادة</w:t>
+      </w:r>
+      <w:r>
+        <w:rPr>
+          <w:b/>
+          <w:bCs/>
+        </w:rPr>
+        <w:t xml:space="preserve"> (108)</w:t>
+      </w:r>
+      <w:r>
+        <w:br/>
+      </w:r>
+      <w:r>
+        <w:rPr>
+          <w:rtl/>
+        </w:rPr>
+        <w:t>يحظر على قائد الدراجة قيادتها بدون الامساك بمقودها (الجادون) أو الامساك به بيد واحدة فقط إلا فى حالة إصدار إشارات يدوية</w:t>
+      </w:r>
+      <w:r>
+        <w:t>.</w:t>
+      </w:r>
+    </w:p>
+    <w:p>
+      <w:pPr>
+        <w:jc w:val="right"/>
+      </w:pPr>
+      <w:r>
+        <w:br/>
+      </w:r>
+      <w:r>
+        <w:rPr>
+          <w:b/>
+          <w:bCs/>
+          <w:rtl/>
+        </w:rPr>
+        <w:t>مادة</w:t>
+      </w:r>
+      <w:r>
+        <w:rPr>
+          <w:b/>
+          <w:bCs/>
+        </w:rPr>
+        <w:t xml:space="preserve"> ( 109)</w:t>
+      </w:r>
+      <w:r>
+        <w:br/>
+      </w:r>
+      <w:r>
+        <w:rPr>
+          <w:rtl/>
+        </w:rPr>
+        <w:t>يحظر على قائد الدراجة الإمساك بمركبة أخرى أثناء السير أو أن يحمل أو يدفع أو يسحب أشياء تعرقل السير أو تكون خطرا عليه أو على باقى مستعملى الطريق ولا يجوز له أن يحمل بضائع على رأسه ولا فى يده أثناء السير</w:t>
+      </w:r>
+      <w:r>
+        <w:t>.</w:t>
+      </w:r>
+    </w:p>
+    <w:p>
+      <w:pPr>
+        <w:jc w:val="right"/>
+      </w:pPr>
+      <w:r>
+        <w:br/>
+      </w:r>
+      <w:r>
+        <w:rPr>
+          <w:b/>
+          <w:bCs/>
+          <w:rtl/>
+        </w:rPr>
+        <w:t>مادة</w:t>
+      </w:r>
+      <w:r>
+        <w:rPr>
+          <w:b/>
+          <w:bCs/>
+        </w:rPr>
+        <w:t xml:space="preserve"> ( 110)</w:t>
+      </w:r>
+      <w:r>
+        <w:br/>
+      </w:r>
+      <w:r>
+        <w:rPr>
+          <w:rtl/>
+        </w:rPr>
+        <w:t>لا يجوز لراكب الدراجة السير معوجا تارة إلى اليمين وأخرى إلى اليسار أو الإندفاع بدراجته بسرعة خطرة أو السير بجوار غيره فى الشوارع والأحياء المزدحمة أو السير بأية حالة أخرى ينجم عنها خطر على الآخرين</w:t>
+      </w:r>
+      <w:r>
+        <w:t>.</w:t>
+      </w:r>
+    </w:p>
+    <w:p>
+      <w:pPr>
+        <w:jc w:val="right"/>
+      </w:pPr>
+      <w:r>
         <w:lastRenderedPageBreak/>
         <w:br/>
       </w:r>
@@ -6403,28 +6398,16 @@
           <w:b/>
           <w:bCs/>
         </w:rPr>
-        <w:t xml:space="preserve"> ( 106)</w:t>
-      </w:r>
-      <w:r>
-        <w:br/>
-      </w:r>
-      <w:r>
-        <w:rPr>
-          <w:rtl/>
-        </w:rPr>
-        <w:t>على قائد أية مركبة من مركبات الأجرة ونقل الركاب وقائدى عربات الركوب ( الحنطور ) الوقوف أمام نقطة المرور بالطرق العامة للتفتيش ويشمل التفتيش رخصهم ورخص مركباتهم وتوافر شروط الترخيص من حيث عدد الركاب أو الحمولة وما يتعلق بذلك من أحكام هذه اللائحة</w:t>
-      </w:r>
-      <w:r>
-        <w:t>. </w:t>
-      </w:r>
-      <w:r>
-        <w:br/>
-      </w:r>
-      <w:r>
-        <w:rPr>
-          <w:rtl/>
-        </w:rPr>
-        <w:t>كما يتناول التفتيش حالة الحيوان الصحية بالنسبة لمركبات النقل البطئ التى يجرها الحيوان وقدرته وتمرنه على الجر فإذا تبين أن الحيوان غير متوافر فيه شروط الصحة أو غير متمرن على الجر يمنع تشغيله إذا رأى الطبيب البيطرى ضرورة ذلك ولا يجوز إعادة تشغيله إلا بعد التصريح بذلك من نفس الطبيب بأنه لائق للتشغيل</w:t>
+        <w:t xml:space="preserve"> ( 111)</w:t>
+      </w:r>
+      <w:r>
+        <w:br/>
+      </w:r>
+      <w:r>
+        <w:rPr>
+          <w:rtl/>
+        </w:rPr>
+        <w:t>لا يجوز لقائد الدراجة إصطحاب غيره معه على الدراجة نفسها إلا إذا كان عمره جاوز 16 سنة وكان للراكب مكان مناسب للجلوس بحيث يكون جلوسه فى نفس إتجاه حركة المرور وكان ثمة ما يحول دون إصطدام ساقى الراكب بأسلاك عجل الدراجة ولا يجوز أن يركب أكثر من واحد دراجة واحدة أعدت لتكون لراكب واحد ولو أضيف أليها مقعد آخر</w:t>
       </w:r>
       <w:r>
         <w:t>.</w:t>
@@ -6444,19 +6427,6 @@
       <w:pPr>
         <w:jc w:val="right"/>
       </w:pPr>
-      <w:r>
-        <w:rPr>
-          <w:b/>
-          <w:bCs/>
-          <w:rtl/>
-        </w:rPr>
-        <w:t>الثالث عشر:الدراجات</w:t>
-      </w:r>
-    </w:p>
-    <w:p>
-      <w:pPr>
-        <w:jc w:val="right"/>
-      </w:pPr>
     </w:p>
     <w:p>
       <w:pPr>
@@ -6475,209 +6445,6 @@
           <w:b/>
           <w:bCs/>
         </w:rPr>
-        <w:t xml:space="preserve"> ( 107) </w:t>
-      </w:r>
-      <w:r>
-        <w:br/>
-      </w:r>
-      <w:r>
-        <w:rPr>
-          <w:rtl/>
-        </w:rPr>
-        <w:t>يكون ركوب الدراجة أو النزول منها على حافة الإفريز الأيمن للطريق وعلى راكبها أن يخفف من سرعته حيث تلاقى الشوارع وعند منعطف الطريق</w:t>
-      </w:r>
-      <w:r>
-        <w:t>.</w:t>
-      </w:r>
-    </w:p>
-    <w:p>
-      <w:pPr>
-        <w:jc w:val="right"/>
-      </w:pPr>
-      <w:r>
-        <w:br/>
-      </w:r>
-      <w:r>
-        <w:rPr>
-          <w:b/>
-          <w:bCs/>
-          <w:rtl/>
-        </w:rPr>
-        <w:t>مادة</w:t>
-      </w:r>
-      <w:r>
-        <w:rPr>
-          <w:b/>
-          <w:bCs/>
-        </w:rPr>
-        <w:t xml:space="preserve"> (108)</w:t>
-      </w:r>
-      <w:r>
-        <w:br/>
-      </w:r>
-      <w:r>
-        <w:rPr>
-          <w:rtl/>
-        </w:rPr>
-        <w:t>يحظر على قائد الدراجة قيادتها بدون الامساك بمقودها (الجادون) أو الامساك به بيد واحدة فقط إلا فى حالة إصدار إشارات يدوية</w:t>
-      </w:r>
-      <w:r>
-        <w:t>.</w:t>
-      </w:r>
-    </w:p>
-    <w:p>
-      <w:pPr>
-        <w:jc w:val="right"/>
-      </w:pPr>
-      <w:r>
-        <w:br/>
-      </w:r>
-      <w:r>
-        <w:rPr>
-          <w:b/>
-          <w:bCs/>
-          <w:rtl/>
-        </w:rPr>
-        <w:t>مادة</w:t>
-      </w:r>
-      <w:r>
-        <w:rPr>
-          <w:b/>
-          <w:bCs/>
-        </w:rPr>
-        <w:t xml:space="preserve"> ( 109)</w:t>
-      </w:r>
-      <w:r>
-        <w:br/>
-      </w:r>
-      <w:r>
-        <w:rPr>
-          <w:rtl/>
-        </w:rPr>
-        <w:t>يحظر على قائد الدراجة الإمساك بمركبة أخرى أثناء السير أو أن يحمل أو يدفع أو يسحب أشياء تعرقل السير أو تكون خطرا عليه أو على باقى مستعملى الطريق ولا يجوز له أن يحمل بضائع على رأسه ولا فى يده أثناء السير</w:t>
-      </w:r>
-      <w:r>
-        <w:t>.</w:t>
-      </w:r>
-    </w:p>
-    <w:p>
-      <w:pPr>
-        <w:jc w:val="right"/>
-      </w:pPr>
-      <w:r>
-        <w:br/>
-      </w:r>
-      <w:r>
-        <w:rPr>
-          <w:b/>
-          <w:bCs/>
-          <w:rtl/>
-        </w:rPr>
-        <w:t>مادة</w:t>
-      </w:r>
-      <w:r>
-        <w:rPr>
-          <w:b/>
-          <w:bCs/>
-        </w:rPr>
-        <w:t xml:space="preserve"> ( 110)</w:t>
-      </w:r>
-      <w:r>
-        <w:br/>
-      </w:r>
-      <w:r>
-        <w:rPr>
-          <w:rtl/>
-        </w:rPr>
-        <w:t>لا يجوز لراكب الدراجة السير معوجا تارة إلى اليمين وأخرى إلى اليسار أو الإندفاع بدراجته بسرعة خطرة أو السير بجوار غيره فى الشوارع والأحياء المزدحمة أو السير بأية حالة أخرى ينجم عنها خطر على الآخرين</w:t>
-      </w:r>
-      <w:r>
-        <w:t>.</w:t>
-      </w:r>
-    </w:p>
-    <w:p>
-      <w:pPr>
-        <w:jc w:val="right"/>
-      </w:pPr>
-      <w:r>
-        <w:br/>
-      </w:r>
-      <w:r>
-        <w:rPr>
-          <w:b/>
-          <w:bCs/>
-          <w:rtl/>
-        </w:rPr>
-        <w:t>مادة</w:t>
-      </w:r>
-      <w:r>
-        <w:rPr>
-          <w:b/>
-          <w:bCs/>
-        </w:rPr>
-        <w:t xml:space="preserve"> ( 111)</w:t>
-      </w:r>
-      <w:r>
-        <w:br/>
-      </w:r>
-      <w:r>
-        <w:rPr>
-          <w:rtl/>
-        </w:rPr>
-        <w:t>لا يجوز لقائد الدراجة إصطحاب غيره معه على الدراجة نفسها إلا إذا كان عمره جاوز 16 سنة وكان للراكب مكان مناسب للجلوس بحيث يكون جلوسه فى نفس إتجاه حركة المرور وكان ثمة ما يحول دون إصطدام ساقى الراكب بأسلاك عجل الدراجة ولا يجوز أن يركب أكثر من واحد دراجة واحدة أعدت لتكون لراكب واحد ولو أضيف أليها مقعد آخر</w:t>
-      </w:r>
-      <w:r>
-        <w:t>.</w:t>
-      </w:r>
-    </w:p>
-    <w:p>
-      <w:pPr>
-        <w:jc w:val="right"/>
-      </w:pPr>
-    </w:p>
-    <w:p>
-      <w:pPr>
-        <w:jc w:val="right"/>
-      </w:pPr>
-    </w:p>
-    <w:p>
-      <w:pPr>
-        <w:jc w:val="right"/>
-      </w:pPr>
-      <w:r>
-        <w:rPr>
-          <w:b/>
-          <w:bCs/>
-          <w:rtl/>
-        </w:rPr>
-        <w:t>الرابع عشر: قواعد مرور المشاة</w:t>
-      </w:r>
-      <w:r>
-        <w:br/>
-      </w:r>
-    </w:p>
-    <w:p>
-      <w:pPr>
-        <w:jc w:val="right"/>
-      </w:pPr>
-    </w:p>
-    <w:p>
-      <w:pPr>
-        <w:jc w:val="right"/>
-      </w:pPr>
-      <w:r>
-        <w:rPr>
-          <w:b/>
-          <w:bCs/>
-          <w:rtl/>
-        </w:rPr>
-        <w:t>مادة</w:t>
-      </w:r>
-      <w:r>
-        <w:rPr>
-          <w:b/>
-          <w:bCs/>
-        </w:rPr>
         <w:t xml:space="preserve"> ( 112)</w:t>
       </w:r>
       <w:r>
@@ -6687,14 +6454,7 @@
         <w:rPr>
           <w:rtl/>
         </w:rPr>
-        <w:t xml:space="preserve">على المشاة السير على الأرصفة وعند وجودها يحظر عليهم السير فى نهر الطريق أو فى الأماكن المخصصة لسير الدراجات .وعند عدم وجود أرصفة فيكون سير المشاة فى أقصى يسار جانب نهر الطريق المضاد لإتجاه مرورهم ومع ذلك يجوز أن يكون سيرهم فى أقصى يمين إتجاه السير بعد تأكدهم من عدم تعرضهم لخطر المركبات اللاحقة لهم .وعند سيرهم فى الطريق خارج المدن فعليهم إلتزام أقصى حافة الطريق المقابلة لإتجاه سيرهم وأن يكونوا فرادى الواحد خلف الآخر كلما أمكن ذلك .ويستثنى من </w:t>
-      </w:r>
-      <w:r>
-        <w:rPr>
-          <w:rtl/>
-        </w:rPr>
-        <w:lastRenderedPageBreak/>
-        <w:t>ذلك مواكب المشاة المصرح بتسييرها فيكون سيرها فى أقصى الحافة اليمنى من نهر الطريق فى إتجاة حركة المرور .ويسرى ذلك إذا كان أحد المشاة يدفع أمامه دراجة أو أية أشياء أخرى</w:t>
+        <w:t>على المشاة السير على الأرصفة وعند وجودها يحظر عليهم السير فى نهر الطريق أو فى الأماكن المخصصة لسير الدراجات .وعند عدم وجود أرصفة فيكون سير المشاة فى أقصى يسار جانب نهر الطريق المضاد لإتجاه مرورهم ومع ذلك يجوز أن يكون سيرهم فى أقصى يمين إتجاه السير بعد تأكدهم من عدم تعرضهم لخطر المركبات اللاحقة لهم .وعند سيرهم فى الطريق خارج المدن فعليهم إلتزام أقصى حافة الطريق المقابلة لإتجاه سيرهم وأن يكونوا فرادى الواحد خلف الآخر كلما أمكن ذلك .ويستثنى من ذلك مواكب المشاة المصرح بتسييرها فيكون سيرها فى أقصى الحافة اليمنى من نهر الطريق فى إتجاة حركة المرور .ويسرى ذلك إذا كان أحد المشاة يدفع أمامه دراجة أو أية أشياء أخرى</w:t>
       </w:r>
       <w:r>
         <w:t>.</w:t>
@@ -6879,17 +6639,6 @@
       <w:pPr>
         <w:jc w:val="right"/>
       </w:pPr>
-      <w:r>
-        <w:rPr>
-          <w:rtl/>
-        </w:rPr>
-        <w:t>خامس عشر : سلوك قائدى المركبات تجاه المشاه</w:t>
-      </w:r>
-    </w:p>
-    <w:p>
-      <w:pPr>
-        <w:jc w:val="right"/>
-      </w:pPr>
     </w:p>
     <w:p>
       <w:pPr>
@@ -6928,6 +6677,7 @@
         <w:jc w:val="right"/>
       </w:pPr>
       <w:r>
+        <w:lastRenderedPageBreak/>
         <w:br/>
       </w:r>
       <w:r>
@@ -7000,7 +6750,6 @@
         <w:jc w:val="right"/>
       </w:pPr>
       <w:r>
-        <w:lastRenderedPageBreak/>
         <w:br/>
       </w:r>
       <w:r>
@@ -7040,19 +6789,6 @@
       <w:pPr>
         <w:jc w:val="right"/>
       </w:pPr>
-    </w:p>
-    <w:p>
-      <w:pPr>
-        <w:jc w:val="right"/>
-      </w:pPr>
-      <w:r>
-        <w:rPr>
-          <w:b/>
-          <w:bCs/>
-          <w:rtl/>
-        </w:rPr>
-        <w:t>علامات وإشارات المرور</w:t>
-      </w:r>
     </w:p>
     <w:p>
       <w:pPr>
@@ -7293,6 +7029,7 @@
         <w:rPr>
           <w:rtl/>
         </w:rPr>
+        <w:lastRenderedPageBreak/>
         <w:t>تحريك الذراع الأيمن أو الأيسر بحركة نصف دائرية يعنى السماح بمرور المركبات فى الإتجاه الذى يشير إليه إتجاه دوران الذراع فى حركة من أعلى إلى أسفل</w:t>
       </w:r>
       <w:r>
@@ -7372,14 +7109,7 @@
         <w:rPr>
           <w:rtl/>
         </w:rPr>
-        <w:t xml:space="preserve">ثانيا : علامات الأولوية : تبين لمستعملى الطرق القواعد الخاصة ببعض الأولويات فى التقاطعات والأجزاء الضيقة من الطريق أو </w:t>
-      </w:r>
-      <w:r>
-        <w:rPr>
-          <w:rtl/>
-        </w:rPr>
-        <w:lastRenderedPageBreak/>
-        <w:t>تفيد أمر قائد المركبة بضرورة التوقف عند العلامة وعدم التحرك مرة ثانية إلا بعد التأكد من إستطاعته ذلك بدون أى خطر</w:t>
+        <w:t>ثانيا : علامات الأولوية : تبين لمستعملى الطرق القواعد الخاصة ببعض الأولويات فى التقاطعات والأجزاء الضيقة من الطريق أو تفيد أمر قائد المركبة بضرورة التوقف عند العلامة وعدم التحرك مرة ثانية إلا بعد التأكد من إستطاعته ذلك بدون أى خطر</w:t>
       </w:r>
       <w:r>
         <w:t xml:space="preserve"> . </w:t>
@@ -7653,6 +7383,7 @@
         <w:rPr>
           <w:rtl/>
         </w:rPr>
+        <w:lastRenderedPageBreak/>
         <w:t>إذا كانت فى وضع رأسى يكون الترتيب ( أحمر – برتقالى – أخضر ) ويجوز تزويد الإشارات بعدسات ذات أسهم خضراء تشير إلى إتجاهات المرور التى تدل عليها الإشارة</w:t>
       </w:r>
       <w:r>
@@ -7743,7 +7474,6 @@
         <w:rPr>
           <w:rtl/>
         </w:rPr>
-        <w:lastRenderedPageBreak/>
         <w:t>النور الأخضر يعنى السماح للمشاة بعبور الطريق</w:t>
       </w:r>
       <w:r>
@@ -8067,6 +7797,7 @@
         <w:rPr>
           <w:rtl/>
         </w:rPr>
+        <w:lastRenderedPageBreak/>
         <w:t>خطان متوازيان بينهما مساحة مناسبة وينظم عبور المشاة عندها رجل مرور أو إشارة ضوئية</w:t>
       </w:r>
       <w:r>
@@ -19388,23 +19119,6 @@
 </file>
 
 <file path=customXml/item1.xml><?xml version="1.0" encoding="utf-8"?>
-<p:properties xmlns:p="http://schemas.microsoft.com/office/2006/metadata/properties" xmlns:xsi="http://www.w3.org/2001/XMLSchema-instance" xmlns:pc="http://schemas.microsoft.com/office/infopath/2007/PartnerControls">
-  <documentManagement>
-    <_activity xmlns="4ebebfb7-086a-499b-b67c-d347161a8585" xsi:nil="true"/>
-  </documentManagement>
-</p:properties>
-</file>
-
-<file path=customXml/item2.xml><?xml version="1.0" encoding="utf-8"?>
-<?mso-contentType ?>
-<FormTemplates xmlns="http://schemas.microsoft.com/sharepoint/v3/contenttype/forms">
-  <Display>DocumentLibraryForm</Display>
-  <Edit>DocumentLibraryForm</Edit>
-  <New>DocumentLibraryForm</New>
-</FormTemplates>
-</file>
-
-<file path=customXml/item3.xml><?xml version="1.0" encoding="utf-8"?>
 <ct:contentTypeSchema xmlns:ct="http://schemas.microsoft.com/office/2006/metadata/contentType" xmlns:ma="http://schemas.microsoft.com/office/2006/metadata/properties/metaAttributes" ct:_="" ma:_="" ma:contentTypeName="Document" ma:contentTypeID="0x0101005DE0D2CBD9C9A447B08FA515E5F221F9" ma:contentTypeVersion="11" ma:contentTypeDescription="Create a new document." ma:contentTypeScope="" ma:versionID="0c7c8810e7cd9a8b978b3a2f41c2614d">
   <xsd:schema xmlns:xsd="http://www.w3.org/2001/XMLSchema" xmlns:xs="http://www.w3.org/2001/XMLSchema" xmlns:p="http://schemas.microsoft.com/office/2006/metadata/properties" xmlns:ns3="4ebebfb7-086a-499b-b67c-d347161a8585" targetNamespace="http://schemas.microsoft.com/office/2006/metadata/properties" ma:root="true" ma:fieldsID="03010d8dc5df2f3df686ee5369d9c1d5" ns3:_="">
     <xsd:import namespace="4ebebfb7-086a-499b-b67c-d347161a8585"/>
@@ -19592,31 +19306,24 @@
 </ct:contentTypeSchema>
 </file>
 
-<file path=customXml/itemProps1.xml><?xml version="1.0" encoding="utf-8"?>
-<ds:datastoreItem xmlns:ds="http://schemas.openxmlformats.org/officeDocument/2006/customXml" ds:itemID="{A943E6BF-D442-4FA6-B4BE-37647B5D833A}">
-  <ds:schemaRefs>
-    <ds:schemaRef ds:uri="http://schemas.microsoft.com/office/infopath/2007/PartnerControls"/>
-    <ds:schemaRef ds:uri="4ebebfb7-086a-499b-b67c-d347161a8585"/>
-    <ds:schemaRef ds:uri="http://purl.org/dc/elements/1.1/"/>
-    <ds:schemaRef ds:uri="http://www.w3.org/XML/1998/namespace"/>
-    <ds:schemaRef ds:uri="http://purl.org/dc/dcmitype/"/>
-    <ds:schemaRef ds:uri="http://purl.org/dc/terms/"/>
-    <ds:schemaRef ds:uri="http://schemas.microsoft.com/office/2006/metadata/properties"/>
-    <ds:schemaRef ds:uri="http://schemas.openxmlformats.org/package/2006/metadata/core-properties"/>
-    <ds:schemaRef ds:uri="http://schemas.microsoft.com/office/2006/documentManagement/types"/>
-  </ds:schemaRefs>
-</ds:datastoreItem>
+<file path=customXml/item2.xml><?xml version="1.0" encoding="utf-8"?>
+<?mso-contentType ?>
+<FormTemplates xmlns="http://schemas.microsoft.com/sharepoint/v3/contenttype/forms">
+  <Display>DocumentLibraryForm</Display>
+  <Edit>DocumentLibraryForm</Edit>
+  <New>DocumentLibraryForm</New>
+</FormTemplates>
 </file>
 
-<file path=customXml/itemProps2.xml><?xml version="1.0" encoding="utf-8"?>
-<ds:datastoreItem xmlns:ds="http://schemas.openxmlformats.org/officeDocument/2006/customXml" ds:itemID="{011B1AAC-8CCE-4E2D-9AA7-1437F8473233}">
-  <ds:schemaRefs>
-    <ds:schemaRef ds:uri="http://schemas.microsoft.com/sharepoint/v3/contenttype/forms"/>
-  </ds:schemaRefs>
-</ds:datastoreItem>
+<file path=customXml/item3.xml><?xml version="1.0" encoding="utf-8"?>
+<p:properties xmlns:p="http://schemas.microsoft.com/office/2006/metadata/properties" xmlns:xsi="http://www.w3.org/2001/XMLSchema-instance" xmlns:pc="http://schemas.microsoft.com/office/infopath/2007/PartnerControls">
+  <documentManagement>
+    <_activity xmlns="4ebebfb7-086a-499b-b67c-d347161a8585" xsi:nil="true"/>
+  </documentManagement>
+</p:properties>
 </file>
 
-<file path=customXml/itemProps3.xml><?xml version="1.0" encoding="utf-8"?>
+<file path=customXml/itemProps1.xml><?xml version="1.0" encoding="utf-8"?>
 <ds:datastoreItem xmlns:ds="http://schemas.openxmlformats.org/officeDocument/2006/customXml" ds:itemID="{3AD93B5F-BBB1-4E96-8B3E-2C904C85FB66}">
   <ds:schemaRefs>
     <ds:schemaRef ds:uri="http://schemas.microsoft.com/office/2006/metadata/contentType"/>
@@ -19632,4 +19339,22 @@
     <ds:schemaRef ds:uri="http://schemas.microsoft.com/internal/obd"/>
   </ds:schemaRefs>
 </ds:datastoreItem>
+</file>
+
+<file path=customXml/itemProps2.xml><?xml version="1.0" encoding="utf-8"?>
+<ds:datastoreItem xmlns:ds="http://schemas.openxmlformats.org/officeDocument/2006/customXml" ds:itemID="{011B1AAC-8CCE-4E2D-9AA7-1437F8473233}">
+  <ds:schemaRefs>
+    <ds:schemaRef ds:uri="http://schemas.microsoft.com/sharepoint/v3/contenttype/forms"/>
+  </ds:schemaRefs>
+</ds:datastoreItem>
+</file>
+
+<file path=customXml/itemProps3.xml><?xml version="1.0" encoding="utf-8"?>
+<ds:datastoreItem xmlns:ds="http://schemas.openxmlformats.org/officeDocument/2006/customXml" ds:itemID="{A943E6BF-D442-4FA6-B4BE-37647B5D833A}">
+  <ds:schemaRefs>
+    <ds:schemaRef ds:uri="http://schemas.microsoft.com/office/2006/metadata/properties"/>
+    <ds:schemaRef ds:uri="http://schemas.microsoft.com/office/infopath/2007/PartnerControls"/>
+    <ds:schemaRef ds:uri="4ebebfb7-086a-499b-b67c-d347161a8585"/>
+  </ds:schemaRefs>
+</ds:datastoreItem>
 </file>
</xml_diff>